<commit_message>
Document filled for week 2
</commit_message>
<xml_diff>
--- a/Sjablonen documenten/Jin/Sjabloon 5 - Log_Jin.docx
+++ b/Sjablonen documenten/Jin/Sjabloon 5 - Log_Jin.docx
@@ -363,11 +363,10 @@
           <w:docPartUnique/>
         </w:docPartObj>
       </w:sdtPr>
-      <w:sdtEndPr/>
       <w:sdtContent>
         <w:p>
           <w:pPr>
-            <w:pStyle w:val="Kopvaninhoudsopgave"/>
+            <w:pStyle w:val="TOCHeading"/>
           </w:pPr>
           <w:r>
             <w:t>Inhoud</w:t>
@@ -375,13 +374,12 @@
         </w:p>
         <w:p>
           <w:pPr>
-            <w:pStyle w:val="Inhopg1"/>
+            <w:pStyle w:val="TOC1"/>
             <w:tabs>
               <w:tab w:val="right" w:leader="dot" w:pos="9062"/>
             </w:tabs>
             <w:rPr>
               <w:rFonts w:eastAsiaTheme="minorEastAsia"/>
-              <w:noProof/>
               <w:kern w:val="2"/>
               <w:sz w:val="24"/>
               <w:szCs w:val="24"/>
@@ -402,54 +400,46 @@
             <w:r>
               <w:rPr>
                 <w:rStyle w:val="Hyperlink"/>
-                <w:noProof/>
               </w:rPr>
               <w:t>Inleiding</w:t>
             </w:r>
             <w:r>
               <w:rPr>
-                <w:noProof/>
                 <w:webHidden/>
               </w:rPr>
               <w:tab/>
             </w:r>
             <w:r>
               <w:rPr>
-                <w:noProof/>
                 <w:webHidden/>
               </w:rPr>
               <w:fldChar w:fldCharType="begin"/>
             </w:r>
             <w:r>
               <w:rPr>
-                <w:noProof/>
                 <w:webHidden/>
               </w:rPr>
               <w:instrText xml:space="preserve"> PAGEREF _Toc202876639 \h </w:instrText>
             </w:r>
             <w:r>
               <w:rPr>
-                <w:noProof/>
                 <w:webHidden/>
               </w:rPr>
             </w:r>
             <w:r>
               <w:rPr>
-                <w:noProof/>
                 <w:webHidden/>
               </w:rPr>
               <w:fldChar w:fldCharType="separate"/>
             </w:r>
             <w:r>
               <w:rPr>
-                <w:noProof/>
                 <w:webHidden/>
               </w:rPr>
               <w:t>3</w:t>
             </w:r>
             <w:r>
               <w:rPr>
-                <w:noProof/>
                 <w:webHidden/>
               </w:rPr>
               <w:fldChar w:fldCharType="end"/>
@@ -458,13 +448,12 @@
         </w:p>
         <w:p>
           <w:pPr>
-            <w:pStyle w:val="Inhopg1"/>
+            <w:pStyle w:val="TOC1"/>
             <w:tabs>
               <w:tab w:val="right" w:leader="dot" w:pos="9062"/>
             </w:tabs>
             <w:rPr>
               <w:rFonts w:eastAsiaTheme="minorEastAsia"/>
-              <w:noProof/>
               <w:kern w:val="2"/>
               <w:sz w:val="24"/>
               <w:szCs w:val="24"/>
@@ -476,54 +465,46 @@
             <w:r>
               <w:rPr>
                 <w:rStyle w:val="Hyperlink"/>
-                <w:noProof/>
               </w:rPr>
               <w:t>Sprint 1</w:t>
             </w:r>
             <w:r>
               <w:rPr>
-                <w:noProof/>
                 <w:webHidden/>
               </w:rPr>
               <w:tab/>
             </w:r>
             <w:r>
               <w:rPr>
-                <w:noProof/>
                 <w:webHidden/>
               </w:rPr>
               <w:fldChar w:fldCharType="begin"/>
             </w:r>
             <w:r>
               <w:rPr>
-                <w:noProof/>
                 <w:webHidden/>
               </w:rPr>
               <w:instrText xml:space="preserve"> PAGEREF _Toc202876640 \h </w:instrText>
             </w:r>
             <w:r>
               <w:rPr>
-                <w:noProof/>
                 <w:webHidden/>
               </w:rPr>
             </w:r>
             <w:r>
               <w:rPr>
-                <w:noProof/>
                 <w:webHidden/>
               </w:rPr>
               <w:fldChar w:fldCharType="separate"/>
             </w:r>
             <w:r>
               <w:rPr>
-                <w:noProof/>
                 <w:webHidden/>
               </w:rPr>
               <w:t>4</w:t>
             </w:r>
             <w:r>
               <w:rPr>
-                <w:noProof/>
                 <w:webHidden/>
               </w:rPr>
               <w:fldChar w:fldCharType="end"/>
@@ -532,13 +513,12 @@
         </w:p>
         <w:p>
           <w:pPr>
-            <w:pStyle w:val="Inhopg1"/>
+            <w:pStyle w:val="TOC1"/>
             <w:tabs>
               <w:tab w:val="right" w:leader="dot" w:pos="9062"/>
             </w:tabs>
             <w:rPr>
               <w:rFonts w:eastAsiaTheme="minorEastAsia"/>
-              <w:noProof/>
               <w:kern w:val="2"/>
               <w:sz w:val="24"/>
               <w:szCs w:val="24"/>
@@ -550,54 +530,46 @@
             <w:r>
               <w:rPr>
                 <w:rStyle w:val="Hyperlink"/>
-                <w:noProof/>
               </w:rPr>
               <w:t>Sprint 2</w:t>
             </w:r>
             <w:r>
               <w:rPr>
-                <w:noProof/>
                 <w:webHidden/>
               </w:rPr>
               <w:tab/>
             </w:r>
             <w:r>
               <w:rPr>
-                <w:noProof/>
                 <w:webHidden/>
               </w:rPr>
               <w:fldChar w:fldCharType="begin"/>
             </w:r>
             <w:r>
               <w:rPr>
-                <w:noProof/>
                 <w:webHidden/>
               </w:rPr>
               <w:instrText xml:space="preserve"> PAGEREF _Toc202876641 \h </w:instrText>
             </w:r>
             <w:r>
               <w:rPr>
-                <w:noProof/>
                 <w:webHidden/>
               </w:rPr>
             </w:r>
             <w:r>
               <w:rPr>
-                <w:noProof/>
                 <w:webHidden/>
               </w:rPr>
               <w:fldChar w:fldCharType="separate"/>
             </w:r>
             <w:r>
               <w:rPr>
-                <w:noProof/>
                 <w:webHidden/>
               </w:rPr>
               <w:t>5</w:t>
             </w:r>
             <w:r>
               <w:rPr>
-                <w:noProof/>
                 <w:webHidden/>
               </w:rPr>
               <w:fldChar w:fldCharType="end"/>
@@ -606,13 +578,12 @@
         </w:p>
         <w:p>
           <w:pPr>
-            <w:pStyle w:val="Inhopg1"/>
+            <w:pStyle w:val="TOC1"/>
             <w:tabs>
               <w:tab w:val="right" w:leader="dot" w:pos="9062"/>
             </w:tabs>
             <w:rPr>
               <w:rFonts w:eastAsiaTheme="minorEastAsia"/>
-              <w:noProof/>
               <w:kern w:val="2"/>
               <w:sz w:val="24"/>
               <w:szCs w:val="24"/>
@@ -624,54 +595,46 @@
             <w:r>
               <w:rPr>
                 <w:rStyle w:val="Hyperlink"/>
-                <w:noProof/>
               </w:rPr>
               <w:t>Sprint 3</w:t>
             </w:r>
             <w:r>
               <w:rPr>
-                <w:noProof/>
                 <w:webHidden/>
               </w:rPr>
               <w:tab/>
             </w:r>
             <w:r>
               <w:rPr>
-                <w:noProof/>
                 <w:webHidden/>
               </w:rPr>
               <w:fldChar w:fldCharType="begin"/>
             </w:r>
             <w:r>
               <w:rPr>
-                <w:noProof/>
                 <w:webHidden/>
               </w:rPr>
               <w:instrText xml:space="preserve"> PAGEREF _Toc202876642 \h </w:instrText>
             </w:r>
             <w:r>
               <w:rPr>
-                <w:noProof/>
                 <w:webHidden/>
               </w:rPr>
             </w:r>
             <w:r>
               <w:rPr>
-                <w:noProof/>
                 <w:webHidden/>
               </w:rPr>
               <w:fldChar w:fldCharType="separate"/>
             </w:r>
             <w:r>
               <w:rPr>
-                <w:noProof/>
                 <w:webHidden/>
               </w:rPr>
               <w:t>6</w:t>
             </w:r>
             <w:r>
               <w:rPr>
-                <w:noProof/>
                 <w:webHidden/>
               </w:rPr>
               <w:fldChar w:fldCharType="end"/>
@@ -704,7 +667,7 @@
     </w:p>
     <w:p>
       <w:pPr>
-        <w:pStyle w:val="Kop1"/>
+        <w:pStyle w:val="Heading1"/>
       </w:pPr>
       <w:bookmarkStart w:id="0" w:name="_Toc202876639"/>
       <w:r>
@@ -743,23 +706,7 @@
           <w:i/>
           <w:iCs/>
         </w:rPr>
-        <w:t xml:space="preserve">leg je verschillende aspecten van het Scrum proces vast om inzicht te krijgen in de voortgang van het project, reflecties op het proces, en actiepunten voor verbetering. Leg </w:t>
-      </w:r>
-      <w:r>
-        <w:rPr>
-          <w:rFonts w:cstheme="minorHAnsi"/>
-          <w:i/>
-          <w:iCs/>
-        </w:rPr>
-        <w:t xml:space="preserve">iedere dag </w:t>
-      </w:r>
-      <w:r>
-        <w:rPr>
-          <w:rFonts w:cstheme="minorHAnsi"/>
-          <w:i/>
-          <w:iCs/>
-        </w:rPr>
-        <w:t>de volgende elementen vas</w:t>
+        <w:t>leg je verschillende aspecten van het Scrum proces vast om inzicht te krijgen in de voortgang van het project, reflecties op het proces, en actiepunten voor verbetering. Leg iedere dag de volgende elementen vas</w:t>
       </w:r>
       <w:r>
         <w:rPr>
@@ -789,7 +736,7 @@
     </w:p>
     <w:p>
       <w:pPr>
-        <w:pStyle w:val="Lijstalinea"/>
+        <w:pStyle w:val="ListParagraph"/>
         <w:numPr>
           <w:ilvl w:val="0"/>
           <w:numId w:val="33"/>
@@ -877,7 +824,7 @@
     </w:p>
     <w:p>
       <w:pPr>
-        <w:pStyle w:val="Lijstalinea"/>
+        <w:pStyle w:val="ListParagraph"/>
         <w:numPr>
           <w:ilvl w:val="0"/>
           <w:numId w:val="33"/>
@@ -928,7 +875,7 @@
     </w:p>
     <w:p>
       <w:pPr>
-        <w:pStyle w:val="Lijstalinea"/>
+        <w:pStyle w:val="ListParagraph"/>
         <w:numPr>
           <w:ilvl w:val="0"/>
           <w:numId w:val="33"/>
@@ -965,7 +912,7 @@
     </w:p>
     <w:p>
       <w:pPr>
-        <w:pStyle w:val="Lijstalinea"/>
+        <w:pStyle w:val="ListParagraph"/>
         <w:numPr>
           <w:ilvl w:val="0"/>
           <w:numId w:val="33"/>
@@ -1002,7 +949,7 @@
     </w:p>
     <w:p>
       <w:pPr>
-        <w:pStyle w:val="Lijstalinea"/>
+        <w:pStyle w:val="ListParagraph"/>
         <w:numPr>
           <w:ilvl w:val="0"/>
           <w:numId w:val="33"/>
@@ -1039,7 +986,7 @@
     </w:p>
     <w:p>
       <w:pPr>
-        <w:pStyle w:val="Lijstalinea"/>
+        <w:pStyle w:val="ListParagraph"/>
         <w:numPr>
           <w:ilvl w:val="0"/>
           <w:numId w:val="33"/>
@@ -1115,7 +1062,7 @@
     </w:p>
     <w:p>
       <w:pPr>
-        <w:pStyle w:val="Lijstalinea"/>
+        <w:pStyle w:val="ListParagraph"/>
         <w:numPr>
           <w:ilvl w:val="0"/>
           <w:numId w:val="33"/>
@@ -1166,7 +1113,7 @@
     </w:p>
     <w:p>
       <w:pPr>
-        <w:pStyle w:val="Lijstalinea"/>
+        <w:pStyle w:val="ListParagraph"/>
         <w:numPr>
           <w:ilvl w:val="0"/>
           <w:numId w:val="33"/>
@@ -1253,7 +1200,7 @@
     </w:p>
     <w:p>
       <w:pPr>
-        <w:pStyle w:val="Kop1"/>
+        <w:pStyle w:val="Heading1"/>
       </w:pPr>
       <w:bookmarkStart w:id="1" w:name="_Toc202876640"/>
       <w:r>
@@ -1267,7 +1214,7 @@
     </w:p>
     <w:p>
       <w:pPr>
-        <w:pStyle w:val="Lijstalinea"/>
+        <w:pStyle w:val="ListParagraph"/>
         <w:numPr>
           <w:ilvl w:val="0"/>
           <w:numId w:val="38"/>
@@ -1278,35 +1225,7 @@
           <w:b/>
           <w:bCs/>
         </w:rPr>
-        <w:t>Kopie/screenshot</w:t>
-      </w:r>
-      <w:r>
-        <w:rPr>
-          <w:b/>
-          <w:bCs/>
-        </w:rPr>
-        <w:t>s</w:t>
-      </w:r>
-      <w:r>
-        <w:rPr>
-          <w:b/>
-          <w:bCs/>
-        </w:rPr>
-        <w:t xml:space="preserve"> van je </w:t>
-      </w:r>
-      <w:r>
-        <w:rPr>
-          <w:b/>
-          <w:bCs/>
-        </w:rPr>
-        <w:t>DAILY</w:t>
-      </w:r>
-      <w:r>
-        <w:rPr>
-          <w:b/>
-          <w:bCs/>
-        </w:rPr>
-        <w:t xml:space="preserve"> </w:t>
+        <w:t xml:space="preserve">Kopie/screenshots van je DAILY </w:t>
       </w:r>
       <w:proofErr w:type="spellStart"/>
       <w:r>
@@ -1314,14 +1233,7 @@
           <w:b/>
           <w:bCs/>
         </w:rPr>
-        <w:t>StandUp</w:t>
-      </w:r>
-      <w:r>
-        <w:rPr>
-          <w:b/>
-          <w:bCs/>
-        </w:rPr>
-        <w:t>s</w:t>
+        <w:t>StandUps</w:t>
       </w:r>
       <w:proofErr w:type="spellEnd"/>
       <w:r>
@@ -1342,8 +1254,241 @@
         <w:rPr>
           <w:i/>
           <w:iCs/>
-        </w:rPr>
-        <w:t>…</w:t>
+          <w:noProof/>
+        </w:rPr>
+        <w:drawing>
+          <wp:inline distT="0" distB="0" distL="0" distR="0" wp14:anchorId="0E195F99" wp14:editId="1004E519">
+            <wp:extent cx="2826871" cy="1693576"/>
+            <wp:effectExtent l="0" t="0" r="0" b="1905"/>
+            <wp:docPr id="1776154403" name="Picture 1" descr="A screenshot of a chat&#10;&#10;AI-generated content may be incorrect."/>
+            <wp:cNvGraphicFramePr>
+              <a:graphicFrameLocks xmlns:a="http://schemas.openxmlformats.org/drawingml/2006/main" noChangeAspect="1"/>
+            </wp:cNvGraphicFramePr>
+            <a:graphic xmlns:a="http://schemas.openxmlformats.org/drawingml/2006/main">
+              <a:graphicData uri="http://schemas.openxmlformats.org/drawingml/2006/picture">
+                <pic:pic xmlns:pic="http://schemas.openxmlformats.org/drawingml/2006/picture">
+                  <pic:nvPicPr>
+                    <pic:cNvPr id="1776154403" name="Picture 1" descr="A screenshot of a chat&#10;&#10;AI-generated content may be incorrect."/>
+                    <pic:cNvPicPr/>
+                  </pic:nvPicPr>
+                  <pic:blipFill>
+                    <a:blip r:embed="rId12">
+                      <a:extLst>
+                        <a:ext uri="{28A0092B-C50C-407E-A947-70E740481C1C}">
+                          <a14:useLocalDpi xmlns:a14="http://schemas.microsoft.com/office/drawing/2010/main" val="0"/>
+                        </a:ext>
+                      </a:extLst>
+                    </a:blip>
+                    <a:stretch>
+                      <a:fillRect/>
+                    </a:stretch>
+                  </pic:blipFill>
+                  <pic:spPr>
+                    <a:xfrm>
+                      <a:off x="0" y="0"/>
+                      <a:ext cx="2838815" cy="1700732"/>
+                    </a:xfrm>
+                    <a:prstGeom prst="rect">
+                      <a:avLst/>
+                    </a:prstGeom>
+                  </pic:spPr>
+                </pic:pic>
+              </a:graphicData>
+            </a:graphic>
+          </wp:inline>
+        </w:drawing>
+      </w:r>
+      <w:r>
+        <w:rPr>
+          <w:i/>
+          <w:iCs/>
+          <w:noProof/>
+        </w:rPr>
+        <w:drawing>
+          <wp:inline distT="0" distB="0" distL="0" distR="0" wp14:anchorId="3B67E531" wp14:editId="4A9F6BFA">
+            <wp:extent cx="3394038" cy="1345718"/>
+            <wp:effectExtent l="0" t="0" r="0" b="6985"/>
+            <wp:docPr id="883776134" name="Picture 2" descr="A screenshot of a computer&#10;&#10;AI-generated content may be incorrect."/>
+            <wp:cNvGraphicFramePr>
+              <a:graphicFrameLocks xmlns:a="http://schemas.openxmlformats.org/drawingml/2006/main" noChangeAspect="1"/>
+            </wp:cNvGraphicFramePr>
+            <a:graphic xmlns:a="http://schemas.openxmlformats.org/drawingml/2006/main">
+              <a:graphicData uri="http://schemas.openxmlformats.org/drawingml/2006/picture">
+                <pic:pic xmlns:pic="http://schemas.openxmlformats.org/drawingml/2006/picture">
+                  <pic:nvPicPr>
+                    <pic:cNvPr id="883776134" name="Picture 2" descr="A screenshot of a computer&#10;&#10;AI-generated content may be incorrect."/>
+                    <pic:cNvPicPr/>
+                  </pic:nvPicPr>
+                  <pic:blipFill>
+                    <a:blip r:embed="rId13" cstate="print">
+                      <a:extLst>
+                        <a:ext uri="{28A0092B-C50C-407E-A947-70E740481C1C}">
+                          <a14:useLocalDpi xmlns:a14="http://schemas.microsoft.com/office/drawing/2010/main" val="0"/>
+                        </a:ext>
+                      </a:extLst>
+                    </a:blip>
+                    <a:stretch>
+                      <a:fillRect/>
+                    </a:stretch>
+                  </pic:blipFill>
+                  <pic:spPr>
+                    <a:xfrm>
+                      <a:off x="0" y="0"/>
+                      <a:ext cx="3416608" cy="1354667"/>
+                    </a:xfrm>
+                    <a:prstGeom prst="rect">
+                      <a:avLst/>
+                    </a:prstGeom>
+                  </pic:spPr>
+                </pic:pic>
+              </a:graphicData>
+            </a:graphic>
+          </wp:inline>
+        </w:drawing>
+      </w:r>
+      <w:r>
+        <w:rPr>
+          <w:i/>
+          <w:iCs/>
+          <w:noProof/>
+        </w:rPr>
+        <w:drawing>
+          <wp:inline distT="0" distB="0" distL="0" distR="0" wp14:anchorId="09504B92" wp14:editId="2261E212">
+            <wp:extent cx="3505574" cy="2617495"/>
+            <wp:effectExtent l="0" t="0" r="0" b="0"/>
+            <wp:docPr id="1495358153" name="Picture 3" descr="A screenshot of a computer&#10;&#10;AI-generated content may be incorrect."/>
+            <wp:cNvGraphicFramePr>
+              <a:graphicFrameLocks xmlns:a="http://schemas.openxmlformats.org/drawingml/2006/main" noChangeAspect="1"/>
+            </wp:cNvGraphicFramePr>
+            <a:graphic xmlns:a="http://schemas.openxmlformats.org/drawingml/2006/main">
+              <a:graphicData uri="http://schemas.openxmlformats.org/drawingml/2006/picture">
+                <pic:pic xmlns:pic="http://schemas.openxmlformats.org/drawingml/2006/picture">
+                  <pic:nvPicPr>
+                    <pic:cNvPr id="1495358153" name="Picture 3" descr="A screenshot of a computer&#10;&#10;AI-generated content may be incorrect."/>
+                    <pic:cNvPicPr/>
+                  </pic:nvPicPr>
+                  <pic:blipFill>
+                    <a:blip r:embed="rId14">
+                      <a:extLst>
+                        <a:ext uri="{28A0092B-C50C-407E-A947-70E740481C1C}">
+                          <a14:useLocalDpi xmlns:a14="http://schemas.microsoft.com/office/drawing/2010/main" val="0"/>
+                        </a:ext>
+                      </a:extLst>
+                    </a:blip>
+                    <a:stretch>
+                      <a:fillRect/>
+                    </a:stretch>
+                  </pic:blipFill>
+                  <pic:spPr>
+                    <a:xfrm>
+                      <a:off x="0" y="0"/>
+                      <a:ext cx="3515605" cy="2624985"/>
+                    </a:xfrm>
+                    <a:prstGeom prst="rect">
+                      <a:avLst/>
+                    </a:prstGeom>
+                  </pic:spPr>
+                </pic:pic>
+              </a:graphicData>
+            </a:graphic>
+          </wp:inline>
+        </w:drawing>
+      </w:r>
+      <w:r>
+        <w:rPr>
+          <w:i/>
+          <w:iCs/>
+          <w:noProof/>
+        </w:rPr>
+        <w:drawing>
+          <wp:inline distT="0" distB="0" distL="0" distR="0" wp14:anchorId="408B6627" wp14:editId="708F9C71">
+            <wp:extent cx="2836904" cy="2103718"/>
+            <wp:effectExtent l="0" t="0" r="1905" b="0"/>
+            <wp:docPr id="1102147624" name="Picture 4" descr="A screenshot of a phone&#10;&#10;AI-generated content may be incorrect."/>
+            <wp:cNvGraphicFramePr>
+              <a:graphicFrameLocks xmlns:a="http://schemas.openxmlformats.org/drawingml/2006/main" noChangeAspect="1"/>
+            </wp:cNvGraphicFramePr>
+            <a:graphic xmlns:a="http://schemas.openxmlformats.org/drawingml/2006/main">
+              <a:graphicData uri="http://schemas.openxmlformats.org/drawingml/2006/picture">
+                <pic:pic xmlns:pic="http://schemas.openxmlformats.org/drawingml/2006/picture">
+                  <pic:nvPicPr>
+                    <pic:cNvPr id="1102147624" name="Picture 4" descr="A screenshot of a phone&#10;&#10;AI-generated content may be incorrect."/>
+                    <pic:cNvPicPr/>
+                  </pic:nvPicPr>
+                  <pic:blipFill>
+                    <a:blip r:embed="rId15">
+                      <a:extLst>
+                        <a:ext uri="{28A0092B-C50C-407E-A947-70E740481C1C}">
+                          <a14:useLocalDpi xmlns:a14="http://schemas.microsoft.com/office/drawing/2010/main" val="0"/>
+                        </a:ext>
+                      </a:extLst>
+                    </a:blip>
+                    <a:stretch>
+                      <a:fillRect/>
+                    </a:stretch>
+                  </pic:blipFill>
+                  <pic:spPr>
+                    <a:xfrm>
+                      <a:off x="0" y="0"/>
+                      <a:ext cx="2852918" cy="2115593"/>
+                    </a:xfrm>
+                    <a:prstGeom prst="rect">
+                      <a:avLst/>
+                    </a:prstGeom>
+                  </pic:spPr>
+                </pic:pic>
+              </a:graphicData>
+            </a:graphic>
+          </wp:inline>
+        </w:drawing>
+      </w:r>
+      <w:r>
+        <w:rPr>
+          <w:i/>
+          <w:iCs/>
+          <w:noProof/>
+        </w:rPr>
+        <w:drawing>
+          <wp:inline distT="0" distB="0" distL="0" distR="0" wp14:anchorId="1C61109A" wp14:editId="767D54C5">
+            <wp:extent cx="2664908" cy="1472867"/>
+            <wp:effectExtent l="0" t="0" r="2540" b="0"/>
+            <wp:docPr id="1478167980" name="Picture 5" descr="A screenshot of a computer&#10;&#10;AI-generated content may be incorrect."/>
+            <wp:cNvGraphicFramePr>
+              <a:graphicFrameLocks xmlns:a="http://schemas.openxmlformats.org/drawingml/2006/main" noChangeAspect="1"/>
+            </wp:cNvGraphicFramePr>
+            <a:graphic xmlns:a="http://schemas.openxmlformats.org/drawingml/2006/main">
+              <a:graphicData uri="http://schemas.openxmlformats.org/drawingml/2006/picture">
+                <pic:pic xmlns:pic="http://schemas.openxmlformats.org/drawingml/2006/picture">
+                  <pic:nvPicPr>
+                    <pic:cNvPr id="1478167980" name="Picture 5" descr="A screenshot of a computer&#10;&#10;AI-generated content may be incorrect."/>
+                    <pic:cNvPicPr/>
+                  </pic:nvPicPr>
+                  <pic:blipFill>
+                    <a:blip r:embed="rId16" cstate="print">
+                      <a:extLst>
+                        <a:ext uri="{28A0092B-C50C-407E-A947-70E740481C1C}">
+                          <a14:useLocalDpi xmlns:a14="http://schemas.microsoft.com/office/drawing/2010/main" val="0"/>
+                        </a:ext>
+                      </a:extLst>
+                    </a:blip>
+                    <a:stretch>
+                      <a:fillRect/>
+                    </a:stretch>
+                  </pic:blipFill>
+                  <pic:spPr>
+                    <a:xfrm>
+                      <a:off x="0" y="0"/>
+                      <a:ext cx="2678939" cy="1480622"/>
+                    </a:xfrm>
+                    <a:prstGeom prst="rect">
+                      <a:avLst/>
+                    </a:prstGeom>
+                  </pic:spPr>
+                </pic:pic>
+              </a:graphicData>
+            </a:graphic>
+          </wp:inline>
+        </w:drawing>
       </w:r>
       <w:r>
         <w:rPr>
@@ -1355,32 +1500,23 @@
     </w:p>
     <w:p>
       <w:pPr>
-        <w:pStyle w:val="Lijstalinea"/>
+        <w:pStyle w:val="ListParagraph"/>
         <w:numPr>
           <w:ilvl w:val="0"/>
           <w:numId w:val="38"/>
         </w:numPr>
-      </w:pPr>
-      <w:r>
-        <w:rPr>
-          <w:b/>
-          <w:bCs/>
-        </w:rPr>
-        <w:t xml:space="preserve">Wat is er </w:t>
-      </w:r>
-      <w:r>
-        <w:rPr>
-          <w:b/>
-          <w:bCs/>
-        </w:rPr>
-        <w:t>in sprint 1</w:t>
-      </w:r>
-      <w:r>
-        <w:rPr>
-          <w:b/>
-          <w:bCs/>
-        </w:rPr>
-        <w:t xml:space="preserve"> bereikt? </w:t>
+        <w:rPr>
+          <w:i/>
+          <w:iCs/>
+        </w:rPr>
+      </w:pPr>
+      <w:r>
+        <w:rPr>
+          <w:b/>
+          <w:bCs/>
+        </w:rPr>
+        <w:lastRenderedPageBreak/>
+        <w:t xml:space="preserve">Wat is er in sprint 1 bereikt? </w:t>
       </w:r>
       <w:r>
         <w:rPr>
@@ -1391,22 +1527,256 @@
       </w:r>
       <w:r>
         <w:rPr>
-          <w:i/>
-          <w:iCs/>
-        </w:rPr>
-        <w:t>…</w:t>
-      </w:r>
-      <w:r>
-        <w:rPr>
-          <w:i/>
-          <w:iCs/>
-        </w:rPr>
-        <w:br/>
+          <w:b/>
+          <w:bCs/>
+          <w:i/>
+          <w:iCs/>
+        </w:rPr>
+        <w:t>I</w:t>
+      </w:r>
+      <w:r>
+        <w:rPr>
+          <w:b/>
+          <w:bCs/>
+          <w:i/>
+          <w:iCs/>
+        </w:rPr>
+        <w:t xml:space="preserve">n deze sprint is een volledig prototype gemaakt van het </w:t>
+      </w:r>
+      <w:proofErr w:type="spellStart"/>
+      <w:r>
+        <w:rPr>
+          <w:b/>
+          <w:bCs/>
+          <w:i/>
+          <w:iCs/>
+        </w:rPr>
+        <w:t>physics</w:t>
+      </w:r>
+      <w:proofErr w:type="spellEnd"/>
+      <w:r>
+        <w:rPr>
+          <w:b/>
+          <w:bCs/>
+          <w:i/>
+          <w:iCs/>
+        </w:rPr>
+        <w:t xml:space="preserve">-concept </w:t>
+      </w:r>
+      <w:proofErr w:type="spellStart"/>
+      <w:r>
+        <w:rPr>
+          <w:b/>
+          <w:bCs/>
+          <w:i/>
+          <w:iCs/>
+        </w:rPr>
+        <w:t>Snow</w:t>
+      </w:r>
+      <w:proofErr w:type="spellEnd"/>
+      <w:r>
+        <w:rPr>
+          <w:b/>
+          <w:bCs/>
+          <w:i/>
+          <w:iCs/>
+        </w:rPr>
+        <w:t xml:space="preserve"> </w:t>
+      </w:r>
+      <w:proofErr w:type="spellStart"/>
+      <w:r>
+        <w:rPr>
+          <w:b/>
+          <w:bCs/>
+          <w:i/>
+          <w:iCs/>
+        </w:rPr>
+        <w:t>Mayhem</w:t>
+      </w:r>
+      <w:proofErr w:type="spellEnd"/>
+      <w:r>
+        <w:rPr>
+          <w:b/>
+          <w:bCs/>
+          <w:i/>
+          <w:iCs/>
+        </w:rPr>
+        <w:t>. De game is deze week helemaal vanaf de basis opgebouwd. De volgende onderdelen zijn gemaakt:</w:t>
       </w:r>
     </w:p>
     <w:p>
       <w:pPr>
-        <w:pStyle w:val="Lijstalinea"/>
+        <w:pStyle w:val="ListParagraph"/>
+        <w:ind w:left="360"/>
+        <w:rPr>
+          <w:i/>
+          <w:iCs/>
+        </w:rPr>
+      </w:pPr>
+      <w:r>
+        <w:rPr>
+          <w:b/>
+          <w:bCs/>
+          <w:i/>
+          <w:iCs/>
+        </w:rPr>
+        <w:t>UI voor het spel</w:t>
+      </w:r>
+    </w:p>
+    <w:p>
+      <w:pPr>
+        <w:pStyle w:val="ListParagraph"/>
+        <w:ind w:left="360"/>
+        <w:rPr>
+          <w:i/>
+          <w:iCs/>
+        </w:rPr>
+      </w:pPr>
+      <w:r>
+        <w:rPr>
+          <w:b/>
+          <w:bCs/>
+          <w:i/>
+          <w:iCs/>
+        </w:rPr>
+        <w:t>Bewegingssysteem, tricks en rotatie</w:t>
+      </w:r>
+    </w:p>
+    <w:p>
+      <w:pPr>
+        <w:pStyle w:val="ListParagraph"/>
+        <w:ind w:left="360"/>
+        <w:rPr>
+          <w:i/>
+          <w:iCs/>
+        </w:rPr>
+      </w:pPr>
+      <w:proofErr w:type="spellStart"/>
+      <w:r>
+        <w:rPr>
+          <w:b/>
+          <w:bCs/>
+          <w:i/>
+          <w:iCs/>
+        </w:rPr>
+        <w:t>Particle</w:t>
+      </w:r>
+      <w:proofErr w:type="spellEnd"/>
+      <w:r>
+        <w:rPr>
+          <w:b/>
+          <w:bCs/>
+          <w:i/>
+          <w:iCs/>
+        </w:rPr>
+        <w:t xml:space="preserve"> system voor het skiën</w:t>
+      </w:r>
+    </w:p>
+    <w:p>
+      <w:pPr>
+        <w:pStyle w:val="ListParagraph"/>
+        <w:ind w:left="360"/>
+        <w:rPr>
+          <w:i/>
+          <w:iCs/>
+        </w:rPr>
+      </w:pPr>
+      <w:r>
+        <w:rPr>
+          <w:b/>
+          <w:bCs/>
+          <w:i/>
+          <w:iCs/>
+        </w:rPr>
+        <w:t>Puntensysteem</w:t>
+      </w:r>
+    </w:p>
+    <w:p>
+      <w:pPr>
+        <w:pStyle w:val="ListParagraph"/>
+        <w:ind w:left="360"/>
+        <w:rPr>
+          <w:i/>
+          <w:iCs/>
+        </w:rPr>
+      </w:pPr>
+      <w:r>
+        <w:rPr>
+          <w:b/>
+          <w:bCs/>
+          <w:i/>
+          <w:iCs/>
+        </w:rPr>
+        <w:t>JSON-opslagsysteem</w:t>
+      </w:r>
+    </w:p>
+    <w:p>
+      <w:pPr>
+        <w:pStyle w:val="ListParagraph"/>
+        <w:ind w:left="360"/>
+        <w:rPr>
+          <w:i/>
+          <w:iCs/>
+        </w:rPr>
+      </w:pPr>
+      <w:proofErr w:type="spellStart"/>
+      <w:r>
+        <w:rPr>
+          <w:b/>
+          <w:bCs/>
+          <w:i/>
+          <w:iCs/>
+        </w:rPr>
+        <w:t>Respawn</w:t>
+      </w:r>
+      <w:proofErr w:type="spellEnd"/>
+      <w:r>
+        <w:rPr>
+          <w:b/>
+          <w:bCs/>
+          <w:i/>
+          <w:iCs/>
+        </w:rPr>
+        <w:t>-systeem</w:t>
+      </w:r>
+    </w:p>
+    <w:p>
+      <w:pPr>
+        <w:pStyle w:val="ListParagraph"/>
+        <w:ind w:left="360"/>
+        <w:rPr>
+          <w:i/>
+          <w:iCs/>
+        </w:rPr>
+      </w:pPr>
+      <w:proofErr w:type="spellStart"/>
+      <w:r>
+        <w:rPr>
+          <w:b/>
+          <w:bCs/>
+          <w:i/>
+          <w:iCs/>
+        </w:rPr>
+        <w:t>Ragdoll-mechanic</w:t>
+      </w:r>
+      <w:proofErr w:type="spellEnd"/>
+    </w:p>
+    <w:p>
+      <w:pPr>
+        <w:pStyle w:val="ListParagraph"/>
+        <w:ind w:left="360"/>
+      </w:pPr>
+      <w:r>
+        <w:rPr>
+          <w:i/>
+          <w:iCs/>
+        </w:rPr>
+        <w:br/>
+      </w:r>
+    </w:p>
+    <w:p>
+      <w:pPr>
+        <w:pStyle w:val="ListParagraph"/>
         <w:numPr>
           <w:ilvl w:val="0"/>
           <w:numId w:val="38"/>
@@ -1431,7 +1801,125 @@
           <w:i/>
           <w:iCs/>
         </w:rPr>
-        <w:t>…</w:t>
+        <w:t xml:space="preserve">Het project </w:t>
+      </w:r>
+      <w:proofErr w:type="spellStart"/>
+      <w:r>
+        <w:rPr>
+          <w:i/>
+          <w:iCs/>
+        </w:rPr>
+        <w:t>physics-based</w:t>
+      </w:r>
+      <w:proofErr w:type="spellEnd"/>
+      <w:r>
+        <w:rPr>
+          <w:i/>
+          <w:iCs/>
+        </w:rPr>
+        <w:t xml:space="preserve"> maken binnen vijf dagen was een grote uitdaging. We moesten daarvoor veel nieuwe technieken toepassen. Ik was verantwoordelijk voor het tricksysteem, wat erg uitdagend was omdat ik moest werken met hoeken (</w:t>
+      </w:r>
+      <w:proofErr w:type="spellStart"/>
+      <w:r>
+        <w:rPr>
+          <w:i/>
+          <w:iCs/>
+        </w:rPr>
+        <w:t>angular</w:t>
+      </w:r>
+      <w:proofErr w:type="spellEnd"/>
+      <w:r>
+        <w:rPr>
+          <w:i/>
+          <w:iCs/>
+        </w:rPr>
+        <w:t xml:space="preserve"> </w:t>
+      </w:r>
+      <w:proofErr w:type="spellStart"/>
+      <w:r>
+        <w:rPr>
+          <w:i/>
+          <w:iCs/>
+        </w:rPr>
+        <w:t>degrees</w:t>
+      </w:r>
+      <w:proofErr w:type="spellEnd"/>
+      <w:r>
+        <w:rPr>
+          <w:i/>
+          <w:iCs/>
+        </w:rPr>
+        <w:t>).</w:t>
+      </w:r>
+      <w:r>
+        <w:rPr>
+          <w:i/>
+          <w:iCs/>
+        </w:rPr>
+        <w:br/>
+        <w:t xml:space="preserve">Oplossing: ik heb de </w:t>
+      </w:r>
+      <w:proofErr w:type="spellStart"/>
+      <w:r>
+        <w:rPr>
+          <w:i/>
+          <w:iCs/>
+        </w:rPr>
+        <w:t>Unity</w:t>
+      </w:r>
+      <w:proofErr w:type="spellEnd"/>
+      <w:r>
+        <w:rPr>
+          <w:i/>
+          <w:iCs/>
+        </w:rPr>
+        <w:t xml:space="preserve">-documentatie gebruikt om informatie te vinden over de </w:t>
+      </w:r>
+      <w:proofErr w:type="spellStart"/>
+      <w:r>
+        <w:rPr>
+          <w:i/>
+          <w:iCs/>
+        </w:rPr>
+        <w:t>MathF-</w:t>
+      </w:r>
+      <w:proofErr w:type="gramStart"/>
+      <w:r>
+        <w:rPr>
+          <w:i/>
+          <w:iCs/>
+        </w:rPr>
+        <w:t>functies.</w:t>
+      </w:r>
+      <w:r>
+        <w:rPr>
+          <w:b/>
+          <w:bCs/>
+        </w:rPr>
+        <w:t>Geleerde</w:t>
+      </w:r>
+      <w:proofErr w:type="spellEnd"/>
+      <w:proofErr w:type="gramEnd"/>
+      <w:r>
+        <w:rPr>
+          <w:b/>
+          <w:bCs/>
+        </w:rPr>
+        <w:t xml:space="preserve"> lessen.</w:t>
+      </w:r>
+      <w:r>
+        <w:rPr>
+          <w:b/>
+          <w:bCs/>
+        </w:rPr>
+        <w:br/>
+      </w:r>
+      <w:r>
+        <w:rPr>
+          <w:i/>
+          <w:iCs/>
+        </w:rPr>
+        <w:t>Ik heb geleerd om te werken met hoeken en snelheid. Dit heb ik geleerd tijdens het maken van een backflip- en frontflip-teller en een op zwaartekracht gebaseerd bewegingssysteem.</w:t>
       </w:r>
       <w:r>
         <w:rPr>
@@ -1443,7 +1931,7 @@
     </w:p>
     <w:p>
       <w:pPr>
-        <w:pStyle w:val="Lijstalinea"/>
+        <w:pStyle w:val="ListParagraph"/>
         <w:numPr>
           <w:ilvl w:val="0"/>
           <w:numId w:val="38"/>
@@ -1454,7 +1942,7 @@
           <w:b/>
           <w:bCs/>
         </w:rPr>
-        <w:t>Geleerde lessen.</w:t>
+        <w:t xml:space="preserve">Vragen en onduidelijkheden. </w:t>
       </w:r>
       <w:r>
         <w:rPr>
@@ -1468,7 +1956,7 @@
           <w:i/>
           <w:iCs/>
         </w:rPr>
-        <w:t>…</w:t>
+        <w:t>Geen vragen dit week</w:t>
       </w:r>
       <w:r>
         <w:rPr>
@@ -1480,18 +1968,22 @@
     </w:p>
     <w:p>
       <w:pPr>
-        <w:pStyle w:val="Lijstalinea"/>
+        <w:pStyle w:val="ListParagraph"/>
         <w:numPr>
           <w:ilvl w:val="0"/>
           <w:numId w:val="38"/>
         </w:numPr>
-      </w:pPr>
-      <w:r>
-        <w:rPr>
-          <w:b/>
-          <w:bCs/>
-        </w:rPr>
-        <w:t xml:space="preserve">Vragen en onduidelijkheden. </w:t>
+        <w:rPr>
+          <w:i/>
+          <w:iCs/>
+        </w:rPr>
+      </w:pPr>
+      <w:r>
+        <w:rPr>
+          <w:b/>
+          <w:bCs/>
+        </w:rPr>
+        <w:t xml:space="preserve">Verbeterpunten voor volgende sprint. </w:t>
       </w:r>
       <w:r>
         <w:rPr>
@@ -1505,7 +1997,14 @@
           <w:i/>
           <w:iCs/>
         </w:rPr>
-        <w:t>…</w:t>
+        <w:t>We</w:t>
+      </w:r>
+      <w:r>
+        <w:rPr>
+          <w:i/>
+          <w:iCs/>
+        </w:rPr>
+        <w:t xml:space="preserve"> moeten prioriteiten stellen aan de systemen voordat we beginnen, zodat we een goede basis hebben om op verder te bouwen. Ook kunnen we elkaar op een prettigere manier feedback geven, zodat we minder stress hebben over de deadlines.</w:t>
       </w:r>
       <w:r>
         <w:rPr>
@@ -1517,36 +2016,18 @@
     </w:p>
     <w:p>
       <w:pPr>
-        <w:pStyle w:val="Lijstalinea"/>
+        <w:pStyle w:val="ListParagraph"/>
         <w:numPr>
           <w:ilvl w:val="0"/>
           <w:numId w:val="38"/>
         </w:numPr>
-        <w:rPr>
-          <w:i/>
-          <w:iCs/>
-        </w:rPr>
-      </w:pPr>
-      <w:r>
-        <w:rPr>
-          <w:b/>
-          <w:bCs/>
-        </w:rPr>
-        <w:t xml:space="preserve">Verbeterpunten voor </w:t>
-      </w:r>
-      <w:r>
-        <w:rPr>
-          <w:b/>
-          <w:bCs/>
-        </w:rPr>
-        <w:t>volgende sprint</w:t>
-      </w:r>
-      <w:r>
-        <w:rPr>
-          <w:b/>
-          <w:bCs/>
-        </w:rPr>
-        <w:t xml:space="preserve">. </w:t>
+      </w:pPr>
+      <w:r>
+        <w:rPr>
+          <w:b/>
+          <w:bCs/>
+        </w:rPr>
+        <w:t xml:space="preserve">Persoonlijk welzijn. </w:t>
       </w:r>
       <w:r>
         <w:rPr>
@@ -1560,8 +2041,33 @@
           <w:i/>
           <w:iCs/>
         </w:rPr>
-        <w:t>…</w:t>
-      </w:r>
+        <w:t xml:space="preserve">Goed, was elke dag bij het project en ging elke dag zelf richten om op </w:t>
+      </w:r>
+      <w:proofErr w:type="gramStart"/>
+      <w:r>
+        <w:rPr>
+          <w:i/>
+          <w:iCs/>
+        </w:rPr>
+        <w:t>de project</w:t>
+      </w:r>
+      <w:proofErr w:type="gramEnd"/>
+      <w:r>
+        <w:rPr>
+          <w:i/>
+          <w:iCs/>
+        </w:rPr>
+        <w:t xml:space="preserve"> te </w:t>
+      </w:r>
+      <w:proofErr w:type="spellStart"/>
+      <w:r>
+        <w:rPr>
+          <w:i/>
+          <w:iCs/>
+        </w:rPr>
+        <w:t>focusen</w:t>
+      </w:r>
+      <w:proofErr w:type="spellEnd"/>
       <w:r>
         <w:rPr>
           <w:i/>
@@ -1572,18 +2078,22 @@
     </w:p>
     <w:p>
       <w:pPr>
-        <w:pStyle w:val="Lijstalinea"/>
+        <w:pStyle w:val="ListParagraph"/>
         <w:numPr>
           <w:ilvl w:val="0"/>
           <w:numId w:val="38"/>
         </w:numPr>
-      </w:pPr>
-      <w:r>
-        <w:rPr>
-          <w:b/>
-          <w:bCs/>
-        </w:rPr>
-        <w:t xml:space="preserve">Persoonlijk welzijn. </w:t>
+        <w:rPr>
+          <w:i/>
+          <w:iCs/>
+        </w:rPr>
+      </w:pPr>
+      <w:r>
+        <w:rPr>
+          <w:b/>
+          <w:bCs/>
+        </w:rPr>
+        <w:t xml:space="preserve">Actiepunten voor de volgende sprint. </w:t>
       </w:r>
       <w:r>
         <w:rPr>
@@ -1597,90 +2107,58 @@
           <w:i/>
           <w:iCs/>
         </w:rPr>
-        <w:t>…</w:t>
-      </w:r>
-      <w:r>
-        <w:rPr>
-          <w:i/>
-          <w:iCs/>
-        </w:rPr>
-        <w:br/>
+        <w:t>A</w:t>
+      </w:r>
+      <w:r>
+        <w:rPr>
+          <w:i/>
+          <w:iCs/>
+        </w:rPr>
+        <w:t xml:space="preserve">an het begin van de volgende sprint willen we een prioriteitenlijst maken en user </w:t>
+      </w:r>
+      <w:proofErr w:type="spellStart"/>
+      <w:r>
+        <w:rPr>
+          <w:i/>
+          <w:iCs/>
+        </w:rPr>
+        <w:t>stories</w:t>
+      </w:r>
+      <w:proofErr w:type="spellEnd"/>
+      <w:r>
+        <w:rPr>
+          <w:i/>
+          <w:iCs/>
+        </w:rPr>
+        <w:t xml:space="preserve"> schrijven over de technieken die we gaan gebruiken. Dit helpt ons om het spel sneller in elkaar te zetten en te testen</w:t>
       </w:r>
     </w:p>
     <w:p>
       <w:pPr>
-        <w:pStyle w:val="Lijstalinea"/>
-        <w:numPr>
-          <w:ilvl w:val="0"/>
-          <w:numId w:val="38"/>
-        </w:numPr>
-        <w:rPr>
-          <w:i/>
-          <w:iCs/>
-        </w:rPr>
-      </w:pPr>
-      <w:r>
-        <w:rPr>
-          <w:b/>
-          <w:bCs/>
-        </w:rPr>
-        <w:t xml:space="preserve">Actiepunten voor de volgende </w:t>
-      </w:r>
-      <w:r>
-        <w:rPr>
-          <w:b/>
-          <w:bCs/>
-        </w:rPr>
-        <w:t>sprint</w:t>
-      </w:r>
-      <w:r>
-        <w:rPr>
-          <w:b/>
-          <w:bCs/>
-        </w:rPr>
-        <w:t xml:space="preserve">. </w:t>
-      </w:r>
-      <w:r>
-        <w:rPr>
-          <w:b/>
-          <w:bCs/>
-        </w:rPr>
-        <w:br/>
-      </w:r>
-      <w:r>
-        <w:rPr>
-          <w:i/>
-          <w:iCs/>
-        </w:rPr>
-        <w:t>…</w:t>
+        <w:rPr>
+          <w:rFonts w:eastAsiaTheme="majorEastAsia" w:cstheme="majorBidi"/>
+          <w:b/>
+          <w:bCs/>
+          <w:i/>
+          <w:color w:val="000000" w:themeColor="text1"/>
+          <w:szCs w:val="24"/>
+        </w:rPr>
+      </w:pPr>
+      <w:r>
+        <w:rPr>
+          <w:rFonts w:eastAsiaTheme="majorEastAsia" w:cstheme="majorBidi"/>
+          <w:b/>
+          <w:bCs/>
+          <w:i/>
+          <w:color w:val="000000" w:themeColor="text1"/>
+          <w:szCs w:val="24"/>
+        </w:rPr>
+        <w:br w:type="page"/>
       </w:r>
     </w:p>
     <w:p>
       <w:pPr>
-        <w:rPr>
-          <w:rFonts w:eastAsiaTheme="majorEastAsia" w:cstheme="majorBidi"/>
-          <w:b/>
-          <w:bCs/>
-          <w:i/>
-          <w:color w:val="000000" w:themeColor="text1"/>
-          <w:szCs w:val="24"/>
-        </w:rPr>
-      </w:pPr>
-      <w:r>
-        <w:rPr>
-          <w:rFonts w:eastAsiaTheme="majorEastAsia" w:cstheme="majorBidi"/>
-          <w:b/>
-          <w:bCs/>
-          <w:i/>
-          <w:color w:val="000000" w:themeColor="text1"/>
-          <w:szCs w:val="24"/>
-        </w:rPr>
-        <w:br w:type="page"/>
-      </w:r>
-    </w:p>
-    <w:p>
-      <w:pPr>
-        <w:pStyle w:val="Kop1"/>
+        <w:pStyle w:val="Heading1"/>
       </w:pPr>
       <w:bookmarkStart w:id="2" w:name="_Toc202876641"/>
       <w:r>
@@ -1691,7 +2169,7 @@
     </w:p>
     <w:p>
       <w:pPr>
-        <w:pStyle w:val="Lijstalinea"/>
+        <w:pStyle w:val="ListParagraph"/>
         <w:numPr>
           <w:ilvl w:val="0"/>
           <w:numId w:val="39"/>
@@ -1702,35 +2180,7 @@
           <w:b/>
           <w:bCs/>
         </w:rPr>
-        <w:t>Kopie/screenshot</w:t>
-      </w:r>
-      <w:r>
-        <w:rPr>
-          <w:b/>
-          <w:bCs/>
-        </w:rPr>
-        <w:t>s</w:t>
-      </w:r>
-      <w:r>
-        <w:rPr>
-          <w:b/>
-          <w:bCs/>
-        </w:rPr>
-        <w:t xml:space="preserve"> van je </w:t>
-      </w:r>
-      <w:r>
-        <w:rPr>
-          <w:b/>
-          <w:bCs/>
-        </w:rPr>
-        <w:t>DAILY</w:t>
-      </w:r>
-      <w:r>
-        <w:rPr>
-          <w:b/>
-          <w:bCs/>
-        </w:rPr>
-        <w:t xml:space="preserve"> </w:t>
+        <w:t xml:space="preserve">Kopie/screenshots van je DAILY </w:t>
       </w:r>
       <w:proofErr w:type="spellStart"/>
       <w:r>
@@ -1738,14 +2188,7 @@
           <w:b/>
           <w:bCs/>
         </w:rPr>
-        <w:t>StandUp</w:t>
-      </w:r>
-      <w:r>
-        <w:rPr>
-          <w:b/>
-          <w:bCs/>
-        </w:rPr>
-        <w:t>s</w:t>
+        <w:t>StandUps</w:t>
       </w:r>
       <w:proofErr w:type="spellEnd"/>
       <w:r>
@@ -1766,8 +2209,193 @@
         <w:rPr>
           <w:i/>
           <w:iCs/>
-        </w:rPr>
-        <w:t>…</w:t>
+          <w:noProof/>
+        </w:rPr>
+        <w:drawing>
+          <wp:inline distT="0" distB="0" distL="0" distR="0" wp14:anchorId="3A6B7D71" wp14:editId="1027316A">
+            <wp:extent cx="3251200" cy="1231743"/>
+            <wp:effectExtent l="0" t="0" r="6350" b="6985"/>
+            <wp:docPr id="1254641404" name="Picture 1" descr="A black screen with white text&#10;&#10;AI-generated content may be incorrect."/>
+            <wp:cNvGraphicFramePr>
+              <a:graphicFrameLocks xmlns:a="http://schemas.openxmlformats.org/drawingml/2006/main" noChangeAspect="1"/>
+            </wp:cNvGraphicFramePr>
+            <a:graphic xmlns:a="http://schemas.openxmlformats.org/drawingml/2006/main">
+              <a:graphicData uri="http://schemas.openxmlformats.org/drawingml/2006/picture">
+                <pic:pic xmlns:pic="http://schemas.openxmlformats.org/drawingml/2006/picture">
+                  <pic:nvPicPr>
+                    <pic:cNvPr id="1254641404" name="Picture 1" descr="A black screen with white text&#10;&#10;AI-generated content may be incorrect."/>
+                    <pic:cNvPicPr/>
+                  </pic:nvPicPr>
+                  <pic:blipFill>
+                    <a:blip r:embed="rId17" cstate="print">
+                      <a:extLst>
+                        <a:ext uri="{28A0092B-C50C-407E-A947-70E740481C1C}">
+                          <a14:useLocalDpi xmlns:a14="http://schemas.microsoft.com/office/drawing/2010/main" val="0"/>
+                        </a:ext>
+                      </a:extLst>
+                    </a:blip>
+                    <a:stretch>
+                      <a:fillRect/>
+                    </a:stretch>
+                  </pic:blipFill>
+                  <pic:spPr>
+                    <a:xfrm>
+                      <a:off x="0" y="0"/>
+                      <a:ext cx="3270428" cy="1239028"/>
+                    </a:xfrm>
+                    <a:prstGeom prst="rect">
+                      <a:avLst/>
+                    </a:prstGeom>
+                  </pic:spPr>
+                </pic:pic>
+              </a:graphicData>
+            </a:graphic>
+          </wp:inline>
+        </w:drawing>
+      </w:r>
+      <w:r>
+        <w:rPr>
+          <w:i/>
+          <w:iCs/>
+          <w:noProof/>
+        </w:rPr>
+        <w:drawing>
+          <wp:inline distT="0" distB="0" distL="0" distR="0" wp14:anchorId="6D37334E" wp14:editId="11A55E81">
+            <wp:extent cx="3003550" cy="1701063"/>
+            <wp:effectExtent l="0" t="0" r="6350" b="0"/>
+            <wp:docPr id="1003748416" name="Picture 2" descr="A screenshot of a computer&#10;&#10;AI-generated content may be incorrect."/>
+            <wp:cNvGraphicFramePr>
+              <a:graphicFrameLocks xmlns:a="http://schemas.openxmlformats.org/drawingml/2006/main" noChangeAspect="1"/>
+            </wp:cNvGraphicFramePr>
+            <a:graphic xmlns:a="http://schemas.openxmlformats.org/drawingml/2006/main">
+              <a:graphicData uri="http://schemas.openxmlformats.org/drawingml/2006/picture">
+                <pic:pic xmlns:pic="http://schemas.openxmlformats.org/drawingml/2006/picture">
+                  <pic:nvPicPr>
+                    <pic:cNvPr id="1003748416" name="Picture 2" descr="A screenshot of a computer&#10;&#10;AI-generated content may be incorrect."/>
+                    <pic:cNvPicPr/>
+                  </pic:nvPicPr>
+                  <pic:blipFill>
+                    <a:blip r:embed="rId18" cstate="print">
+                      <a:extLst>
+                        <a:ext uri="{28A0092B-C50C-407E-A947-70E740481C1C}">
+                          <a14:useLocalDpi xmlns:a14="http://schemas.microsoft.com/office/drawing/2010/main" val="0"/>
+                        </a:ext>
+                      </a:extLst>
+                    </a:blip>
+                    <a:stretch>
+                      <a:fillRect/>
+                    </a:stretch>
+                  </pic:blipFill>
+                  <pic:spPr>
+                    <a:xfrm>
+                      <a:off x="0" y="0"/>
+                      <a:ext cx="3013427" cy="1706657"/>
+                    </a:xfrm>
+                    <a:prstGeom prst="rect">
+                      <a:avLst/>
+                    </a:prstGeom>
+                  </pic:spPr>
+                </pic:pic>
+              </a:graphicData>
+            </a:graphic>
+          </wp:inline>
+        </w:drawing>
+      </w:r>
+      <w:r>
+        <w:rPr>
+          <w:i/>
+          <w:iCs/>
+          <w:noProof/>
+        </w:rPr>
+        <w:drawing>
+          <wp:inline distT="0" distB="0" distL="0" distR="0" wp14:anchorId="7ABE553B" wp14:editId="74F2071A">
+            <wp:extent cx="3079750" cy="2130420"/>
+            <wp:effectExtent l="0" t="0" r="6350" b="3810"/>
+            <wp:docPr id="831226559" name="Picture 3" descr="A screenshot of a black and white message&#10;&#10;AI-generated content may be incorrect."/>
+            <wp:cNvGraphicFramePr>
+              <a:graphicFrameLocks xmlns:a="http://schemas.openxmlformats.org/drawingml/2006/main" noChangeAspect="1"/>
+            </wp:cNvGraphicFramePr>
+            <a:graphic xmlns:a="http://schemas.openxmlformats.org/drawingml/2006/main">
+              <a:graphicData uri="http://schemas.openxmlformats.org/drawingml/2006/picture">
+                <pic:pic xmlns:pic="http://schemas.openxmlformats.org/drawingml/2006/picture">
+                  <pic:nvPicPr>
+                    <pic:cNvPr id="831226559" name="Picture 3" descr="A screenshot of a black and white message&#10;&#10;AI-generated content may be incorrect."/>
+                    <pic:cNvPicPr/>
+                  </pic:nvPicPr>
+                  <pic:blipFill>
+                    <a:blip r:embed="rId19">
+                      <a:extLst>
+                        <a:ext uri="{28A0092B-C50C-407E-A947-70E740481C1C}">
+                          <a14:useLocalDpi xmlns:a14="http://schemas.microsoft.com/office/drawing/2010/main" val="0"/>
+                        </a:ext>
+                      </a:extLst>
+                    </a:blip>
+                    <a:stretch>
+                      <a:fillRect/>
+                    </a:stretch>
+                  </pic:blipFill>
+                  <pic:spPr>
+                    <a:xfrm>
+                      <a:off x="0" y="0"/>
+                      <a:ext cx="3109213" cy="2150801"/>
+                    </a:xfrm>
+                    <a:prstGeom prst="rect">
+                      <a:avLst/>
+                    </a:prstGeom>
+                  </pic:spPr>
+                </pic:pic>
+              </a:graphicData>
+            </a:graphic>
+          </wp:inline>
+        </w:drawing>
+      </w:r>
+      <w:r>
+        <w:rPr>
+          <w:i/>
+          <w:iCs/>
+          <w:noProof/>
+        </w:rPr>
+        <w:drawing>
+          <wp:inline distT="0" distB="0" distL="0" distR="0" wp14:anchorId="3E404DC5" wp14:editId="289906C4">
+            <wp:extent cx="3195320" cy="1902681"/>
+            <wp:effectExtent l="0" t="0" r="5080" b="2540"/>
+            <wp:docPr id="113047425" name="Picture 4" descr="A screenshot of a computer&#10;&#10;AI-generated content may be incorrect."/>
+            <wp:cNvGraphicFramePr>
+              <a:graphicFrameLocks xmlns:a="http://schemas.openxmlformats.org/drawingml/2006/main" noChangeAspect="1"/>
+            </wp:cNvGraphicFramePr>
+            <a:graphic xmlns:a="http://schemas.openxmlformats.org/drawingml/2006/main">
+              <a:graphicData uri="http://schemas.openxmlformats.org/drawingml/2006/picture">
+                <pic:pic xmlns:pic="http://schemas.openxmlformats.org/drawingml/2006/picture">
+                  <pic:nvPicPr>
+                    <pic:cNvPr id="113047425" name="Picture 4" descr="A screenshot of a computer&#10;&#10;AI-generated content may be incorrect."/>
+                    <pic:cNvPicPr/>
+                  </pic:nvPicPr>
+                  <pic:blipFill>
+                    <a:blip r:embed="rId20" cstate="print">
+                      <a:extLst>
+                        <a:ext uri="{28A0092B-C50C-407E-A947-70E740481C1C}">
+                          <a14:useLocalDpi xmlns:a14="http://schemas.microsoft.com/office/drawing/2010/main" val="0"/>
+                        </a:ext>
+                      </a:extLst>
+                    </a:blip>
+                    <a:stretch>
+                      <a:fillRect/>
+                    </a:stretch>
+                  </pic:blipFill>
+                  <pic:spPr>
+                    <a:xfrm>
+                      <a:off x="0" y="0"/>
+                      <a:ext cx="3216689" cy="1915405"/>
+                    </a:xfrm>
+                    <a:prstGeom prst="rect">
+                      <a:avLst/>
+                    </a:prstGeom>
+                  </pic:spPr>
+                </pic:pic>
+              </a:graphicData>
+            </a:graphic>
+          </wp:inline>
+        </w:drawing>
       </w:r>
       <w:r>
         <w:rPr>
@@ -1779,7 +2407,31 @@
     </w:p>
     <w:p>
       <w:pPr>
-        <w:pStyle w:val="Lijstalinea"/>
+        <w:pStyle w:val="ListParagraph"/>
+        <w:ind w:left="360"/>
+      </w:pPr>
+    </w:p>
+    <w:p>
+      <w:pPr>
+        <w:pStyle w:val="ListParagraph"/>
+        <w:ind w:left="360"/>
+      </w:pPr>
+    </w:p>
+    <w:p>
+      <w:pPr>
+        <w:pStyle w:val="ListParagraph"/>
+        <w:ind w:left="360"/>
+      </w:pPr>
+    </w:p>
+    <w:p>
+      <w:pPr>
+        <w:pStyle w:val="ListParagraph"/>
+        <w:ind w:left="360"/>
+      </w:pPr>
+    </w:p>
+    <w:p>
+      <w:pPr>
+        <w:pStyle w:val="ListParagraph"/>
         <w:numPr>
           <w:ilvl w:val="0"/>
           <w:numId w:val="39"/>
@@ -1790,14 +2442,8 @@
           <w:b/>
           <w:bCs/>
         </w:rPr>
-        <w:t xml:space="preserve">Wat is er </w:t>
-      </w:r>
-      <w:r>
-        <w:rPr>
-          <w:b/>
-          <w:bCs/>
-        </w:rPr>
-        <w:t xml:space="preserve">in sprint </w:t>
+        <w:lastRenderedPageBreak/>
+        <w:t xml:space="preserve">Wat is er in sprint </w:t>
       </w:r>
       <w:r>
         <w:rPr>
@@ -1825,7 +2471,55 @@
           <w:i/>
           <w:iCs/>
         </w:rPr>
-        <w:t>…</w:t>
+        <w:t xml:space="preserve">We hebben de belangrijkste </w:t>
+      </w:r>
+      <w:proofErr w:type="spellStart"/>
+      <w:r>
+        <w:rPr>
+          <w:i/>
+          <w:iCs/>
+        </w:rPr>
+        <w:t>mechanics</w:t>
+      </w:r>
+      <w:proofErr w:type="spellEnd"/>
+      <w:r>
+        <w:rPr>
+          <w:i/>
+          <w:iCs/>
+        </w:rPr>
+        <w:t xml:space="preserve"> van de game afgerond. De speler kan het paintballwapen oppakken en ermee </w:t>
+      </w:r>
+      <w:proofErr w:type="spellStart"/>
+      <w:r>
+        <w:rPr>
+          <w:i/>
+          <w:iCs/>
+        </w:rPr>
+        <w:t>paintballs</w:t>
+      </w:r>
+      <w:proofErr w:type="spellEnd"/>
+      <w:r>
+        <w:rPr>
+          <w:i/>
+          <w:iCs/>
+        </w:rPr>
+        <w:t xml:space="preserve"> afvuren. Wanneer een paintball een object raakt, verschijnt er een verf-effect. De speler ziet ook bewegende </w:t>
+      </w:r>
+      <w:proofErr w:type="spellStart"/>
+      <w:r>
+        <w:rPr>
+          <w:i/>
+          <w:iCs/>
+        </w:rPr>
+        <w:t>dummies</w:t>
+      </w:r>
+      <w:proofErr w:type="spellEnd"/>
+      <w:r>
+        <w:rPr>
+          <w:i/>
+          <w:iCs/>
+        </w:rPr>
+        <w:t xml:space="preserve"> in de game.</w:t>
       </w:r>
       <w:r>
         <w:rPr>
@@ -1837,7 +2531,7 @@
     </w:p>
     <w:p>
       <w:pPr>
-        <w:pStyle w:val="Lijstalinea"/>
+        <w:pStyle w:val="ListParagraph"/>
         <w:numPr>
           <w:ilvl w:val="0"/>
           <w:numId w:val="39"/>
@@ -1862,19 +2556,66 @@
           <w:i/>
           <w:iCs/>
         </w:rPr>
-        <w:t>…</w:t>
-      </w:r>
-      <w:r>
-        <w:rPr>
-          <w:i/>
-          <w:iCs/>
-        </w:rPr>
-        <w:br/>
+        <w:t xml:space="preserve">Werken met VR was niet alleen een uitdaging voor mij, maar ook voor mijn groep. We moesten veel dingen vanaf de basis leren. Een obstakel dat ik had, was het koppelen van het schieten van de </w:t>
+      </w:r>
+      <w:proofErr w:type="spellStart"/>
+      <w:r>
+        <w:rPr>
+          <w:i/>
+          <w:iCs/>
+        </w:rPr>
+        <w:t>paintballs</w:t>
+      </w:r>
+      <w:proofErr w:type="spellEnd"/>
+      <w:r>
+        <w:rPr>
+          <w:i/>
+          <w:iCs/>
+        </w:rPr>
+        <w:t xml:space="preserve"> aan ons </w:t>
+      </w:r>
+      <w:r>
+        <w:rPr>
+          <w:b/>
+          <w:bCs/>
+          <w:i/>
+          <w:iCs/>
+        </w:rPr>
+        <w:t>event system control</w:t>
+      </w:r>
+      <w:r>
+        <w:rPr>
+          <w:i/>
+          <w:iCs/>
+        </w:rPr>
+        <w:t xml:space="preserve">-mechanisme. Dat is een </w:t>
+      </w:r>
+      <w:proofErr w:type="spellStart"/>
+      <w:r>
+        <w:rPr>
+          <w:i/>
+          <w:iCs/>
+        </w:rPr>
+        <w:t>Unity</w:t>
+      </w:r>
+      <w:proofErr w:type="spellEnd"/>
+      <w:r>
+        <w:rPr>
+          <w:i/>
+          <w:iCs/>
+        </w:rPr>
+        <w:t>-package, maar het is vrij uitgebreid. De oplossing die ik heb gevonden, was om de benodigde code toe te voegen in het script dat met de events werkt.</w:t>
       </w:r>
     </w:p>
     <w:p>
       <w:pPr>
-        <w:pStyle w:val="Lijstalinea"/>
+        <w:pStyle w:val="ListParagraph"/>
+        <w:ind w:left="360"/>
+      </w:pPr>
+    </w:p>
+    <w:p>
+      <w:pPr>
+        <w:pStyle w:val="ListParagraph"/>
         <w:numPr>
           <w:ilvl w:val="0"/>
           <w:numId w:val="39"/>
@@ -1899,7 +2640,84 @@
           <w:i/>
           <w:iCs/>
         </w:rPr>
-        <w:t>…</w:t>
+        <w:t xml:space="preserve">Ik heb geleerd om een </w:t>
+      </w:r>
+      <w:proofErr w:type="spellStart"/>
+      <w:r>
+        <w:rPr>
+          <w:b/>
+          <w:bCs/>
+          <w:i/>
+          <w:iCs/>
+        </w:rPr>
+        <w:t>coroutine</w:t>
+      </w:r>
+      <w:proofErr w:type="spellEnd"/>
+      <w:r>
+        <w:rPr>
+          <w:i/>
+          <w:iCs/>
+        </w:rPr>
+        <w:t xml:space="preserve"> te gebruiken binnen een </w:t>
+      </w:r>
+      <w:proofErr w:type="spellStart"/>
+      <w:r>
+        <w:rPr>
+          <w:b/>
+          <w:bCs/>
+          <w:i/>
+          <w:iCs/>
+        </w:rPr>
+        <w:t>conditional</w:t>
+      </w:r>
+      <w:proofErr w:type="spellEnd"/>
+      <w:r>
+        <w:rPr>
+          <w:b/>
+          <w:bCs/>
+          <w:i/>
+          <w:iCs/>
+        </w:rPr>
+        <w:t xml:space="preserve"> statement</w:t>
+      </w:r>
+      <w:r>
+        <w:rPr>
+          <w:i/>
+          <w:iCs/>
+        </w:rPr>
+        <w:t xml:space="preserve">. Dit heb ik toegepast in het </w:t>
+      </w:r>
+      <w:proofErr w:type="spellStart"/>
+      <w:r>
+        <w:rPr>
+          <w:i/>
+          <w:iCs/>
+        </w:rPr>
+        <w:t>reload</w:t>
+      </w:r>
+      <w:proofErr w:type="spellEnd"/>
+      <w:r>
+        <w:rPr>
+          <w:i/>
+          <w:iCs/>
+        </w:rPr>
+        <w:t xml:space="preserve">-systeem, zodat er maar één </w:t>
+      </w:r>
+      <w:r>
+        <w:rPr>
+          <w:b/>
+          <w:bCs/>
+          <w:i/>
+          <w:iCs/>
+        </w:rPr>
+        <w:t>Update</w:t>
+      </w:r>
+      <w:r>
+        <w:rPr>
+          <w:i/>
+          <w:iCs/>
+        </w:rPr>
+        <w:t>-functie nodig is die de munitie controleert en bepaalt wanneer de speler moet herladen.</w:t>
       </w:r>
       <w:r>
         <w:rPr>
@@ -1911,7 +2729,7 @@
     </w:p>
     <w:p>
       <w:pPr>
-        <w:pStyle w:val="Lijstalinea"/>
+        <w:pStyle w:val="ListParagraph"/>
         <w:numPr>
           <w:ilvl w:val="0"/>
           <w:numId w:val="39"/>
@@ -1936,7 +2754,41 @@
           <w:i/>
           <w:iCs/>
         </w:rPr>
-        <w:t>…</w:t>
+        <w:t xml:space="preserve">Het </w:t>
+      </w:r>
+      <w:proofErr w:type="spellStart"/>
+      <w:r>
+        <w:rPr>
+          <w:i/>
+          <w:iCs/>
+        </w:rPr>
+        <w:t>bijrolverdelingsdocument</w:t>
+      </w:r>
+      <w:proofErr w:type="spellEnd"/>
+      <w:r>
+        <w:rPr>
+          <w:i/>
+          <w:iCs/>
+        </w:rPr>
+        <w:t xml:space="preserve"> is verwarrend. Ik dacht eerst dat we voor elk teamlid een apart document moesten schrijven (dus feedback geven aan iedereen). Omdat ik niet zeker wist of dat de bedoeling was, heb ik dit aan de opdrachtgever gevraagd. Ik kreeg toen te horen dat je alleen feedback aan jezelf moest geven en de </w:t>
+      </w:r>
+      <w:proofErr w:type="spellStart"/>
+      <w:r>
+        <w:rPr>
+          <w:b/>
+          <w:bCs/>
+          <w:i/>
+          <w:iCs/>
+        </w:rPr>
+        <w:t>retrospective</w:t>
+      </w:r>
+      <w:proofErr w:type="spellEnd"/>
+      <w:r>
+        <w:rPr>
+          <w:i/>
+          <w:iCs/>
+        </w:rPr>
+        <w:t xml:space="preserve"> moest gebruiken om de feedback gezamenlijk te bespreken. Maar nu, bij deze sprint, hoor ik dat we toch feedback aan elk ander teamlid moeten geven.</w:t>
       </w:r>
       <w:r>
         <w:rPr>
@@ -1948,7 +2800,7 @@
     </w:p>
     <w:p>
       <w:pPr>
-        <w:pStyle w:val="Lijstalinea"/>
+        <w:pStyle w:val="ListParagraph"/>
         <w:numPr>
           <w:ilvl w:val="0"/>
           <w:numId w:val="39"/>
@@ -1963,21 +2815,7 @@
           <w:b/>
           <w:bCs/>
         </w:rPr>
-        <w:t xml:space="preserve">Verbeterpunten voor </w:t>
-      </w:r>
-      <w:r>
-        <w:rPr>
-          <w:b/>
-          <w:bCs/>
-        </w:rPr>
-        <w:t>volgende sprint</w:t>
-      </w:r>
-      <w:r>
-        <w:rPr>
-          <w:b/>
-          <w:bCs/>
-        </w:rPr>
-        <w:t xml:space="preserve">. </w:t>
+        <w:t xml:space="preserve">Verbeterpunten voor volgende sprint. </w:t>
       </w:r>
       <w:r>
         <w:rPr>
@@ -1991,19 +2829,38 @@
           <w:i/>
           <w:iCs/>
         </w:rPr>
-        <w:t>…</w:t>
-      </w:r>
-      <w:r>
-        <w:rPr>
-          <w:i/>
-          <w:iCs/>
-        </w:rPr>
-        <w:br/>
+        <w:t>Wij hadden problemen met sommige user-</w:t>
+      </w:r>
+      <w:proofErr w:type="spellStart"/>
+      <w:r>
+        <w:rPr>
+          <w:i/>
+          <w:iCs/>
+        </w:rPr>
+        <w:t>stories</w:t>
+      </w:r>
+      <w:proofErr w:type="spellEnd"/>
+      <w:r>
+        <w:rPr>
+          <w:i/>
+          <w:iCs/>
+        </w:rPr>
+        <w:t>. Teamleden waren erg lang bezig om ze af te ronden, omdat ze vaak al aan een nieuwe user story begonnen voordat de vorige volledig af was. Dit kan beter. Teamleden moeten een user story helemaal afmaken en testen voordat ze doorgaan naar de volgende.</w:t>
       </w:r>
     </w:p>
     <w:p>
       <w:pPr>
-        <w:pStyle w:val="Lijstalinea"/>
+        <w:pStyle w:val="ListParagraph"/>
+        <w:ind w:left="360"/>
+        <w:rPr>
+          <w:i/>
+          <w:iCs/>
+        </w:rPr>
+      </w:pPr>
+    </w:p>
+    <w:p>
+      <w:pPr>
+        <w:pStyle w:val="ListParagraph"/>
         <w:numPr>
           <w:ilvl w:val="0"/>
           <w:numId w:val="39"/>
@@ -2016,31 +2873,25 @@
         </w:rPr>
         <w:t xml:space="preserve">Persoonlijk welzijn. </w:t>
       </w:r>
-      <w:r>
-        <w:rPr>
-          <w:b/>
-          <w:bCs/>
-        </w:rPr>
-        <w:br/>
-      </w:r>
-      <w:r>
-        <w:rPr>
-          <w:i/>
-          <w:iCs/>
-        </w:rPr>
-        <w:t>…</w:t>
-      </w:r>
-      <w:r>
-        <w:rPr>
-          <w:i/>
-          <w:iCs/>
-        </w:rPr>
-        <w:br/>
-      </w:r>
     </w:p>
     <w:p>
       <w:pPr>
-        <w:pStyle w:val="Lijstalinea"/>
+        <w:pStyle w:val="ListParagraph"/>
+        <w:ind w:left="360"/>
+      </w:pPr>
+      <w:r>
+        <w:t>Deze week was minder stressvol, omdat we veel feedback hadden om mee te werken. We hadden al een duidelijk idee over wat we de volgende keer moeten verbeteren en wat hetzelfde kan blijven.</w:t>
+      </w:r>
+    </w:p>
+    <w:p>
+      <w:pPr>
+        <w:pStyle w:val="ListParagraph"/>
+        <w:ind w:left="360"/>
+      </w:pPr>
+    </w:p>
+    <w:p>
+      <w:pPr>
+        <w:pStyle w:val="ListParagraph"/>
         <w:numPr>
           <w:ilvl w:val="0"/>
           <w:numId w:val="39"/>
@@ -2055,39 +2906,12 @@
           <w:b/>
           <w:bCs/>
         </w:rPr>
-        <w:t xml:space="preserve">Actiepunten voor de volgende </w:t>
-      </w:r>
-      <w:r>
-        <w:rPr>
-          <w:b/>
-          <w:bCs/>
-        </w:rPr>
-        <w:t>sprint</w:t>
-      </w:r>
-      <w:r>
-        <w:rPr>
-          <w:b/>
-          <w:bCs/>
-        </w:rPr>
-        <w:t xml:space="preserve">. </w:t>
-      </w:r>
-      <w:r>
-        <w:rPr>
-          <w:b/>
-          <w:bCs/>
-        </w:rPr>
-        <w:br/>
-      </w:r>
-      <w:r>
-        <w:rPr>
-          <w:i/>
-          <w:iCs/>
-        </w:rPr>
-        <w:t>…</w:t>
+        <w:t xml:space="preserve">Actiepunten voor de volgende sprint. </w:t>
       </w:r>
     </w:p>
     <w:p>
       <w:pPr>
+        <w:ind w:left="360"/>
         <w:rPr>
           <w:rFonts w:eastAsiaTheme="majorEastAsia" w:cstheme="majorBidi"/>
           <w:b/>
@@ -2098,6 +2922,17 @@
         </w:rPr>
       </w:pPr>
       <w:r>
+        <w:t xml:space="preserve">Voor de volgende sprint moeten we meer naar elkaars werk kijken en de werkzaamheden goed volgen, zodat de user </w:t>
+      </w:r>
+      <w:proofErr w:type="spellStart"/>
+      <w:r>
+        <w:t>stories</w:t>
+      </w:r>
+      <w:proofErr w:type="spellEnd"/>
+      <w:r>
+        <w:t xml:space="preserve"> volledig afgerond worden. Om dit doel te bereiken, is ons actiepunt om aan het einde van de dag elkaars werk na te kijken.</w:t>
+      </w:r>
+      <w:r>
         <w:rPr>
           <w:rFonts w:eastAsiaTheme="majorEastAsia" w:cstheme="majorBidi"/>
           <w:b/>
@@ -2111,7 +2946,7 @@
     </w:p>
     <w:p>
       <w:pPr>
-        <w:pStyle w:val="Kop1"/>
+        <w:pStyle w:val="Heading1"/>
       </w:pPr>
       <w:bookmarkStart w:id="3" w:name="_Toc202876642"/>
       <w:r>
@@ -2122,7 +2957,7 @@
     </w:p>
     <w:p>
       <w:pPr>
-        <w:pStyle w:val="Lijstalinea"/>
+        <w:pStyle w:val="ListParagraph"/>
         <w:numPr>
           <w:ilvl w:val="0"/>
           <w:numId w:val="40"/>
@@ -2133,35 +2968,7 @@
           <w:b/>
           <w:bCs/>
         </w:rPr>
-        <w:t>Kopie/screenshot</w:t>
-      </w:r>
-      <w:r>
-        <w:rPr>
-          <w:b/>
-          <w:bCs/>
-        </w:rPr>
-        <w:t>s</w:t>
-      </w:r>
-      <w:r>
-        <w:rPr>
-          <w:b/>
-          <w:bCs/>
-        </w:rPr>
-        <w:t xml:space="preserve"> van je </w:t>
-      </w:r>
-      <w:r>
-        <w:rPr>
-          <w:b/>
-          <w:bCs/>
-        </w:rPr>
-        <w:t>DAILY</w:t>
-      </w:r>
-      <w:r>
-        <w:rPr>
-          <w:b/>
-          <w:bCs/>
-        </w:rPr>
-        <w:t xml:space="preserve"> </w:t>
+        <w:t xml:space="preserve">Kopie/screenshots van je DAILY </w:t>
       </w:r>
       <w:proofErr w:type="spellStart"/>
       <w:r>
@@ -2169,14 +2976,7 @@
           <w:b/>
           <w:bCs/>
         </w:rPr>
-        <w:t>StandUp</w:t>
-      </w:r>
-      <w:r>
-        <w:rPr>
-          <w:b/>
-          <w:bCs/>
-        </w:rPr>
-        <w:t>s</w:t>
+        <w:t>StandUps</w:t>
       </w:r>
       <w:proofErr w:type="spellEnd"/>
       <w:r>
@@ -2210,7 +3010,7 @@
     </w:p>
     <w:p>
       <w:pPr>
-        <w:pStyle w:val="Lijstalinea"/>
+        <w:pStyle w:val="ListParagraph"/>
         <w:numPr>
           <w:ilvl w:val="0"/>
           <w:numId w:val="40"/>
@@ -2221,14 +3021,7 @@
           <w:b/>
           <w:bCs/>
         </w:rPr>
-        <w:t xml:space="preserve">Wat is er </w:t>
-      </w:r>
-      <w:r>
-        <w:rPr>
-          <w:b/>
-          <w:bCs/>
-        </w:rPr>
-        <w:t xml:space="preserve">in sprint </w:t>
+        <w:t xml:space="preserve">Wat is er in sprint </w:t>
       </w:r>
       <w:r>
         <w:rPr>
@@ -2268,7 +3061,7 @@
     </w:p>
     <w:p>
       <w:pPr>
-        <w:pStyle w:val="Lijstalinea"/>
+        <w:pStyle w:val="ListParagraph"/>
         <w:numPr>
           <w:ilvl w:val="0"/>
           <w:numId w:val="40"/>
@@ -2305,7 +3098,7 @@
     </w:p>
     <w:p>
       <w:pPr>
-        <w:pStyle w:val="Lijstalinea"/>
+        <w:pStyle w:val="ListParagraph"/>
         <w:numPr>
           <w:ilvl w:val="0"/>
           <w:numId w:val="40"/>
@@ -2342,7 +3135,7 @@
     </w:p>
     <w:p>
       <w:pPr>
-        <w:pStyle w:val="Lijstalinea"/>
+        <w:pStyle w:val="ListParagraph"/>
         <w:numPr>
           <w:ilvl w:val="0"/>
           <w:numId w:val="40"/>
@@ -2379,7 +3172,7 @@
     </w:p>
     <w:p>
       <w:pPr>
-        <w:pStyle w:val="Lijstalinea"/>
+        <w:pStyle w:val="ListParagraph"/>
         <w:numPr>
           <w:ilvl w:val="0"/>
           <w:numId w:val="40"/>
@@ -2394,21 +3187,7 @@
           <w:b/>
           <w:bCs/>
         </w:rPr>
-        <w:t xml:space="preserve">Verbeterpunten voor </w:t>
-      </w:r>
-      <w:r>
-        <w:rPr>
-          <w:b/>
-          <w:bCs/>
-        </w:rPr>
-        <w:t>volgende sprint</w:t>
-      </w:r>
-      <w:r>
-        <w:rPr>
-          <w:b/>
-          <w:bCs/>
-        </w:rPr>
-        <w:t xml:space="preserve">. </w:t>
+        <w:t xml:space="preserve">Verbeterpunten voor volgende sprint. </w:t>
       </w:r>
       <w:r>
         <w:rPr>
@@ -2434,7 +3213,7 @@
     </w:p>
     <w:p>
       <w:pPr>
-        <w:pStyle w:val="Lijstalinea"/>
+        <w:pStyle w:val="ListParagraph"/>
         <w:numPr>
           <w:ilvl w:val="0"/>
           <w:numId w:val="40"/>
@@ -2471,7 +3250,7 @@
     </w:p>
     <w:p>
       <w:pPr>
-        <w:pStyle w:val="Lijstalinea"/>
+        <w:pStyle w:val="ListParagraph"/>
         <w:numPr>
           <w:ilvl w:val="0"/>
           <w:numId w:val="40"/>
@@ -2500,9 +3279,9 @@
       </w:r>
     </w:p>
     <w:sectPr>
-      <w:footerReference w:type="default" r:id="rId12"/>
-      <w:headerReference w:type="first" r:id="rId13"/>
-      <w:footerReference w:type="first" r:id="rId14"/>
+      <w:footerReference w:type="default" r:id="rId21"/>
+      <w:headerReference w:type="first" r:id="rId22"/>
+      <w:footerReference w:type="first" r:id="rId23"/>
       <w:pgSz w:w="11906" w:h="16838"/>
       <w:pgMar w:top="1417" w:right="1417" w:bottom="1417" w:left="1417" w:header="708" w:footer="708" w:gutter="0"/>
       <w:cols w:space="708"/>
@@ -2868,7 +3647,7 @@
 <w:hdr xmlns:wpc="http://schemas.microsoft.com/office/word/2010/wordprocessingCanvas" xmlns:cx="http://schemas.microsoft.com/office/drawing/2014/chartex" xmlns:cx1="http://schemas.microsoft.com/office/drawing/2015/9/8/chartex" xmlns:cx2="http://schemas.microsoft.com/office/drawing/2015/10/21/chartex" xmlns:cx3="http://schemas.microsoft.com/office/drawing/2016/5/9/chartex" xmlns:cx4="http://schemas.microsoft.com/office/drawing/2016/5/10/chartex" xmlns:cx5="http://schemas.microsoft.com/office/drawing/2016/5/11/chartex" xmlns:cx6="http://schemas.microsoft.com/office/drawing/2016/5/12/chartex" xmlns:cx7="http://schemas.microsoft.com/office/drawing/2016/5/13/chartex" xmlns:cx8="http://schemas.microsoft.com/office/drawing/2016/5/14/chartex" xmlns:mc="http://schemas.openxmlformats.org/markup-compatibility/2006" xmlns:aink="http://schemas.microsoft.com/office/drawing/2016/ink" xmlns:am3d="http://schemas.microsoft.com/office/drawing/2017/model3d" xmlns:o="urn:schemas-microsoft-com:office:office" xmlns:oel="http://schemas.microsoft.com/office/2019/extlst" xmlns:r="http://schemas.openxmlformats.org/officeDocument/2006/relationships" xmlns:m="http://schemas.openxmlformats.org/officeDocument/2006/math" xmlns:v="urn:schemas-microsoft-com:vml" xmlns:wp14="http://schemas.microsoft.com/office/word/2010/wordprocessingDrawing" xmlns:wp="http://schemas.openxmlformats.org/drawingml/2006/wordprocessingDrawing" xmlns:w10="urn:schemas-microsoft-com:office:word" xmlns:w="http://schemas.openxmlformats.org/wordprocessingml/2006/main" xmlns:w14="http://schemas.microsoft.com/office/word/2010/wordml" xmlns:w15="http://schemas.microsoft.com/office/word/2012/wordml" xmlns:w16cex="http://schemas.microsoft.com/office/word/2018/wordml/cex" xmlns:w16cid="http://schemas.microsoft.com/office/word/2016/wordml/cid" xmlns:w16="http://schemas.microsoft.com/office/word/2018/wordml" xmlns:w16du="http://schemas.microsoft.com/office/word/2023/wordml/word16du" xmlns:w16sdtdh="http://schemas.microsoft.com/office/word/2020/wordml/sdtdatahash" xmlns:w16sdtfl="http://schemas.microsoft.com/office/word/2024/wordml/sdtformatlock" xmlns:w16se="http://schemas.microsoft.com/office/word/2015/wordml/symex" xmlns:wpg="http://schemas.microsoft.com/office/word/2010/wordprocessingGroup" xmlns:wpi="http://schemas.microsoft.com/office/word/2010/wordprocessingInk" xmlns:wne="http://schemas.microsoft.com/office/word/2006/wordml" xmlns:wps="http://schemas.microsoft.com/office/word/2010/wordprocessingShape" mc:Ignorable="w14 w15 w16se w16cid w16 w16cex w16sdtdh w16sdtfl w16du wp14">
   <w:p>
     <w:pPr>
-      <w:pStyle w:val="Koptekst"/>
+      <w:pStyle w:val="Header"/>
       <w:jc w:val="center"/>
     </w:pPr>
     <w:r>
@@ -2927,7 +3706,7 @@
   </w:p>
   <w:p>
     <w:pPr>
-      <w:pStyle w:val="Koptekst"/>
+      <w:pStyle w:val="Header"/>
     </w:pPr>
   </w:p>
 </w:hdr>
@@ -5502,6 +6281,155 @@
     </w:lvl>
   </w:abstractNum>
   <w:abstractNum w:abstractNumId="27" w15:restartNumberingAfterBreak="0">
+    <w:nsid w:val="52BC4885"/>
+    <w:multiLevelType w:val="multilevel"/>
+    <w:tmpl w:val="D74E7704"/>
+    <w:lvl w:ilvl="0">
+      <w:start w:val="1"/>
+      <w:numFmt w:val="bullet"/>
+      <w:lvlText w:val=""/>
+      <w:lvlJc w:val="left"/>
+      <w:pPr>
+        <w:tabs>
+          <w:tab w:val="num" w:pos="720"/>
+        </w:tabs>
+        <w:ind w:left="720" w:hanging="360"/>
+      </w:pPr>
+      <w:rPr>
+        <w:rFonts w:ascii="Symbol" w:hAnsi="Symbol" w:hint="default"/>
+        <w:sz w:val="20"/>
+      </w:rPr>
+    </w:lvl>
+    <w:lvl w:ilvl="1" w:tentative="1">
+      <w:start w:val="1"/>
+      <w:numFmt w:val="bullet"/>
+      <w:lvlText w:val="o"/>
+      <w:lvlJc w:val="left"/>
+      <w:pPr>
+        <w:tabs>
+          <w:tab w:val="num" w:pos="1440"/>
+        </w:tabs>
+        <w:ind w:left="1440" w:hanging="360"/>
+      </w:pPr>
+      <w:rPr>
+        <w:rFonts w:ascii="Courier New" w:hAnsi="Courier New" w:hint="default"/>
+        <w:sz w:val="20"/>
+      </w:rPr>
+    </w:lvl>
+    <w:lvl w:ilvl="2" w:tentative="1">
+      <w:start w:val="1"/>
+      <w:numFmt w:val="bullet"/>
+      <w:lvlText w:val=""/>
+      <w:lvlJc w:val="left"/>
+      <w:pPr>
+        <w:tabs>
+          <w:tab w:val="num" w:pos="2160"/>
+        </w:tabs>
+        <w:ind w:left="2160" w:hanging="360"/>
+      </w:pPr>
+      <w:rPr>
+        <w:rFonts w:ascii="Wingdings" w:hAnsi="Wingdings" w:hint="default"/>
+        <w:sz w:val="20"/>
+      </w:rPr>
+    </w:lvl>
+    <w:lvl w:ilvl="3" w:tentative="1">
+      <w:start w:val="1"/>
+      <w:numFmt w:val="bullet"/>
+      <w:lvlText w:val=""/>
+      <w:lvlJc w:val="left"/>
+      <w:pPr>
+        <w:tabs>
+          <w:tab w:val="num" w:pos="2880"/>
+        </w:tabs>
+        <w:ind w:left="2880" w:hanging="360"/>
+      </w:pPr>
+      <w:rPr>
+        <w:rFonts w:ascii="Wingdings" w:hAnsi="Wingdings" w:hint="default"/>
+        <w:sz w:val="20"/>
+      </w:rPr>
+    </w:lvl>
+    <w:lvl w:ilvl="4" w:tentative="1">
+      <w:start w:val="1"/>
+      <w:numFmt w:val="bullet"/>
+      <w:lvlText w:val=""/>
+      <w:lvlJc w:val="left"/>
+      <w:pPr>
+        <w:tabs>
+          <w:tab w:val="num" w:pos="3600"/>
+        </w:tabs>
+        <w:ind w:left="3600" w:hanging="360"/>
+      </w:pPr>
+      <w:rPr>
+        <w:rFonts w:ascii="Wingdings" w:hAnsi="Wingdings" w:hint="default"/>
+        <w:sz w:val="20"/>
+      </w:rPr>
+    </w:lvl>
+    <w:lvl w:ilvl="5" w:tentative="1">
+      <w:start w:val="1"/>
+      <w:numFmt w:val="bullet"/>
+      <w:lvlText w:val=""/>
+      <w:lvlJc w:val="left"/>
+      <w:pPr>
+        <w:tabs>
+          <w:tab w:val="num" w:pos="4320"/>
+        </w:tabs>
+        <w:ind w:left="4320" w:hanging="360"/>
+      </w:pPr>
+      <w:rPr>
+        <w:rFonts w:ascii="Wingdings" w:hAnsi="Wingdings" w:hint="default"/>
+        <w:sz w:val="20"/>
+      </w:rPr>
+    </w:lvl>
+    <w:lvl w:ilvl="6" w:tentative="1">
+      <w:start w:val="1"/>
+      <w:numFmt w:val="bullet"/>
+      <w:lvlText w:val=""/>
+      <w:lvlJc w:val="left"/>
+      <w:pPr>
+        <w:tabs>
+          <w:tab w:val="num" w:pos="5040"/>
+        </w:tabs>
+        <w:ind w:left="5040" w:hanging="360"/>
+      </w:pPr>
+      <w:rPr>
+        <w:rFonts w:ascii="Wingdings" w:hAnsi="Wingdings" w:hint="default"/>
+        <w:sz w:val="20"/>
+      </w:rPr>
+    </w:lvl>
+    <w:lvl w:ilvl="7" w:tentative="1">
+      <w:start w:val="1"/>
+      <w:numFmt w:val="bullet"/>
+      <w:lvlText w:val=""/>
+      <w:lvlJc w:val="left"/>
+      <w:pPr>
+        <w:tabs>
+          <w:tab w:val="num" w:pos="5760"/>
+        </w:tabs>
+        <w:ind w:left="5760" w:hanging="360"/>
+      </w:pPr>
+      <w:rPr>
+        <w:rFonts w:ascii="Wingdings" w:hAnsi="Wingdings" w:hint="default"/>
+        <w:sz w:val="20"/>
+      </w:rPr>
+    </w:lvl>
+    <w:lvl w:ilvl="8" w:tentative="1">
+      <w:start w:val="1"/>
+      <w:numFmt w:val="bullet"/>
+      <w:lvlText w:val=""/>
+      <w:lvlJc w:val="left"/>
+      <w:pPr>
+        <w:tabs>
+          <w:tab w:val="num" w:pos="6480"/>
+        </w:tabs>
+        <w:ind w:left="6480" w:hanging="360"/>
+      </w:pPr>
+      <w:rPr>
+        <w:rFonts w:ascii="Wingdings" w:hAnsi="Wingdings" w:hint="default"/>
+        <w:sz w:val="20"/>
+      </w:rPr>
+    </w:lvl>
+  </w:abstractNum>
+  <w:abstractNum w:abstractNumId="28" w15:restartNumberingAfterBreak="0">
     <w:nsid w:val="54297952"/>
     <w:multiLevelType w:val="hybridMultilevel"/>
     <w:tmpl w:val="E68667EE"/>
@@ -5587,7 +6515,7 @@
       </w:pPr>
     </w:lvl>
   </w:abstractNum>
-  <w:abstractNum w:abstractNumId="28" w15:restartNumberingAfterBreak="0">
+  <w:abstractNum w:abstractNumId="29" w15:restartNumberingAfterBreak="0">
     <w:nsid w:val="5D902C32"/>
     <w:multiLevelType w:val="hybridMultilevel"/>
     <w:tmpl w:val="6EC891E8"/>
@@ -5673,7 +6601,7 @@
       </w:pPr>
     </w:lvl>
   </w:abstractNum>
-  <w:abstractNum w:abstractNumId="29" w15:restartNumberingAfterBreak="0">
+  <w:abstractNum w:abstractNumId="30" w15:restartNumberingAfterBreak="0">
     <w:nsid w:val="5EC33394"/>
     <w:multiLevelType w:val="multilevel"/>
     <w:tmpl w:val="C8261284"/>
@@ -5762,7 +6690,7 @@
       </w:pPr>
     </w:lvl>
   </w:abstractNum>
-  <w:abstractNum w:abstractNumId="30" w15:restartNumberingAfterBreak="0">
+  <w:abstractNum w:abstractNumId="31" w15:restartNumberingAfterBreak="0">
     <w:nsid w:val="60486F26"/>
     <w:multiLevelType w:val="hybridMultilevel"/>
     <w:tmpl w:val="11C06BD8"/>
@@ -5848,7 +6776,7 @@
       </w:pPr>
     </w:lvl>
   </w:abstractNum>
-  <w:abstractNum w:abstractNumId="31" w15:restartNumberingAfterBreak="0">
+  <w:abstractNum w:abstractNumId="32" w15:restartNumberingAfterBreak="0">
     <w:nsid w:val="61B35E24"/>
     <w:multiLevelType w:val="hybridMultilevel"/>
     <w:tmpl w:val="E68667EE"/>
@@ -5934,7 +6862,7 @@
       </w:pPr>
     </w:lvl>
   </w:abstractNum>
-  <w:abstractNum w:abstractNumId="32" w15:restartNumberingAfterBreak="0">
+  <w:abstractNum w:abstractNumId="33" w15:restartNumberingAfterBreak="0">
     <w:nsid w:val="691A658C"/>
     <w:multiLevelType w:val="hybridMultilevel"/>
     <w:tmpl w:val="E68667EE"/>
@@ -6020,7 +6948,7 @@
       </w:pPr>
     </w:lvl>
   </w:abstractNum>
-  <w:abstractNum w:abstractNumId="33" w15:restartNumberingAfterBreak="0">
+  <w:abstractNum w:abstractNumId="34" w15:restartNumberingAfterBreak="0">
     <w:nsid w:val="6D313243"/>
     <w:multiLevelType w:val="hybridMultilevel"/>
     <w:tmpl w:val="FFFFFFFF"/>
@@ -6106,7 +7034,7 @@
       </w:pPr>
     </w:lvl>
   </w:abstractNum>
-  <w:abstractNum w:abstractNumId="34" w15:restartNumberingAfterBreak="0">
+  <w:abstractNum w:abstractNumId="35" w15:restartNumberingAfterBreak="0">
     <w:nsid w:val="6DBC20FC"/>
     <w:multiLevelType w:val="hybridMultilevel"/>
     <w:tmpl w:val="C96E1428"/>
@@ -6196,7 +7124,7 @@
       </w:pPr>
     </w:lvl>
   </w:abstractNum>
-  <w:abstractNum w:abstractNumId="35" w15:restartNumberingAfterBreak="0">
+  <w:abstractNum w:abstractNumId="36" w15:restartNumberingAfterBreak="0">
     <w:nsid w:val="6E201864"/>
     <w:multiLevelType w:val="hybridMultilevel"/>
     <w:tmpl w:val="E68667EE"/>
@@ -6282,7 +7210,7 @@
       </w:pPr>
     </w:lvl>
   </w:abstractNum>
-  <w:abstractNum w:abstractNumId="36" w15:restartNumberingAfterBreak="0">
+  <w:abstractNum w:abstractNumId="37" w15:restartNumberingAfterBreak="0">
     <w:nsid w:val="6FC11B7F"/>
     <w:multiLevelType w:val="hybridMultilevel"/>
     <w:tmpl w:val="21DA27D4"/>
@@ -6368,7 +7296,7 @@
       </w:pPr>
     </w:lvl>
   </w:abstractNum>
-  <w:abstractNum w:abstractNumId="37" w15:restartNumberingAfterBreak="0">
+  <w:abstractNum w:abstractNumId="38" w15:restartNumberingAfterBreak="0">
     <w:nsid w:val="733743B4"/>
     <w:multiLevelType w:val="hybridMultilevel"/>
     <w:tmpl w:val="E68667EE"/>
@@ -6454,7 +7382,7 @@
       </w:pPr>
     </w:lvl>
   </w:abstractNum>
-  <w:abstractNum w:abstractNumId="38" w15:restartNumberingAfterBreak="0">
+  <w:abstractNum w:abstractNumId="39" w15:restartNumberingAfterBreak="0">
     <w:nsid w:val="77DD2363"/>
     <w:multiLevelType w:val="hybridMultilevel"/>
     <w:tmpl w:val="11C06BD8"/>
@@ -6540,7 +7468,7 @@
       </w:pPr>
     </w:lvl>
   </w:abstractNum>
-  <w:abstractNum w:abstractNumId="39" w15:restartNumberingAfterBreak="0">
+  <w:abstractNum w:abstractNumId="40" w15:restartNumberingAfterBreak="0">
     <w:nsid w:val="7C731799"/>
     <w:multiLevelType w:val="hybridMultilevel"/>
     <w:tmpl w:val="11C06BD8"/>
@@ -6626,7 +7554,7 @@
       </w:pPr>
     </w:lvl>
   </w:abstractNum>
-  <w:abstractNum w:abstractNumId="40" w15:restartNumberingAfterBreak="0">
+  <w:abstractNum w:abstractNumId="41" w15:restartNumberingAfterBreak="0">
     <w:nsid w:val="7E2477B9"/>
     <w:multiLevelType w:val="hybridMultilevel"/>
     <w:tmpl w:val="B044C4A8"/>
@@ -6728,10 +7656,10 @@
     <w:abstractNumId w:val="22"/>
   </w:num>
   <w:num w:numId="5" w16cid:durableId="1374421500">
-    <w:abstractNumId w:val="28"/>
+    <w:abstractNumId w:val="29"/>
   </w:num>
   <w:num w:numId="6" w16cid:durableId="267205637">
-    <w:abstractNumId w:val="29"/>
+    <w:abstractNumId w:val="30"/>
   </w:num>
   <w:num w:numId="7" w16cid:durableId="2020111381">
     <w:abstractNumId w:val="5"/>
@@ -6743,7 +7671,7 @@
     <w:abstractNumId w:val="0"/>
   </w:num>
   <w:num w:numId="10" w16cid:durableId="774713555">
-    <w:abstractNumId w:val="40"/>
+    <w:abstractNumId w:val="41"/>
   </w:num>
   <w:num w:numId="11" w16cid:durableId="13263071">
     <w:abstractNumId w:val="6"/>
@@ -6770,31 +7698,31 @@
     <w:abstractNumId w:val="13"/>
   </w:num>
   <w:num w:numId="19" w16cid:durableId="575240923">
-    <w:abstractNumId w:val="36"/>
+    <w:abstractNumId w:val="37"/>
   </w:num>
   <w:num w:numId="20" w16cid:durableId="967008093">
     <w:abstractNumId w:val="24"/>
   </w:num>
   <w:num w:numId="21" w16cid:durableId="337737478">
-    <w:abstractNumId w:val="27"/>
+    <w:abstractNumId w:val="28"/>
   </w:num>
   <w:num w:numId="22" w16cid:durableId="1441952610">
-    <w:abstractNumId w:val="31"/>
+    <w:abstractNumId w:val="32"/>
   </w:num>
   <w:num w:numId="23" w16cid:durableId="132870284">
     <w:abstractNumId w:val="16"/>
   </w:num>
   <w:num w:numId="24" w16cid:durableId="2086609993">
-    <w:abstractNumId w:val="32"/>
+    <w:abstractNumId w:val="33"/>
   </w:num>
   <w:num w:numId="25" w16cid:durableId="2087334323">
-    <w:abstractNumId w:val="35"/>
+    <w:abstractNumId w:val="36"/>
   </w:num>
   <w:num w:numId="26" w16cid:durableId="2091460789">
-    <w:abstractNumId w:val="33"/>
+    <w:abstractNumId w:val="34"/>
   </w:num>
   <w:num w:numId="27" w16cid:durableId="1079594051">
-    <w:abstractNumId w:val="34"/>
+    <w:abstractNumId w:val="35"/>
   </w:num>
   <w:num w:numId="28" w16cid:durableId="74982123">
     <w:abstractNumId w:val="19"/>
@@ -6803,7 +7731,7 @@
     <w:abstractNumId w:val="25"/>
   </w:num>
   <w:num w:numId="30" w16cid:durableId="147941437">
-    <w:abstractNumId w:val="37"/>
+    <w:abstractNumId w:val="38"/>
   </w:num>
   <w:num w:numId="31" w16cid:durableId="524682150">
     <w:abstractNumId w:val="2"/>
@@ -6815,13 +7743,13 @@
     <w:abstractNumId w:val="18"/>
   </w:num>
   <w:num w:numId="34" w16cid:durableId="1232547484">
-    <w:abstractNumId w:val="38"/>
+    <w:abstractNumId w:val="39"/>
   </w:num>
   <w:num w:numId="35" w16cid:durableId="1269585269">
-    <w:abstractNumId w:val="30"/>
+    <w:abstractNumId w:val="31"/>
   </w:num>
   <w:num w:numId="36" w16cid:durableId="164127806">
-    <w:abstractNumId w:val="39"/>
+    <w:abstractNumId w:val="40"/>
   </w:num>
   <w:num w:numId="37" w16cid:durableId="645009040">
     <w:abstractNumId w:val="8"/>
@@ -6837,6 +7765,9 @@
   </w:num>
   <w:num w:numId="41" w16cid:durableId="479424721">
     <w:abstractNumId w:val="20"/>
+  </w:num>
+  <w:num w:numId="42" w16cid:durableId="421071767">
+    <w:abstractNumId w:val="27"/>
   </w:num>
 </w:numbering>
 </file>
@@ -7236,16 +8167,16 @@
     <w:lsdException w:name="Unresolved Mention" w:semiHidden="1" w:unhideWhenUsed="1"/>
     <w:lsdException w:name="Smart Link" w:semiHidden="1" w:unhideWhenUsed="1"/>
   </w:latentStyles>
-  <w:style w:type="paragraph" w:default="1" w:styleId="Standaard">
+  <w:style w:type="paragraph" w:default="1" w:styleId="Normal">
     <w:name w:val="Normal"/>
     <w:qFormat/>
     <w:rsid w:val="00B44264"/>
   </w:style>
-  <w:style w:type="paragraph" w:styleId="Kop1">
+  <w:style w:type="paragraph" w:styleId="Heading1">
     <w:name w:val="heading 1"/>
-    <w:basedOn w:val="Standaard"/>
-    <w:next w:val="Standaard"/>
-    <w:link w:val="Kop1Char"/>
+    <w:basedOn w:val="Normal"/>
+    <w:next w:val="Normal"/>
+    <w:link w:val="Heading1Char"/>
     <w:uiPriority w:val="9"/>
     <w:qFormat/>
     <w:rsid w:val="00AE17AC"/>
@@ -7262,11 +8193,11 @@
       <w:szCs w:val="32"/>
     </w:rPr>
   </w:style>
-  <w:style w:type="paragraph" w:styleId="Kop2">
+  <w:style w:type="paragraph" w:styleId="Heading2">
     <w:name w:val="heading 2"/>
-    <w:basedOn w:val="Standaard"/>
-    <w:next w:val="Standaard"/>
-    <w:link w:val="Kop2Char"/>
+    <w:basedOn w:val="Normal"/>
+    <w:next w:val="Normal"/>
+    <w:link w:val="Heading2Char"/>
     <w:uiPriority w:val="9"/>
     <w:unhideWhenUsed/>
     <w:qFormat/>
@@ -7285,11 +8216,11 @@
       <w:szCs w:val="26"/>
     </w:rPr>
   </w:style>
-  <w:style w:type="paragraph" w:styleId="Kop3">
+  <w:style w:type="paragraph" w:styleId="Heading3">
     <w:name w:val="heading 3"/>
-    <w:basedOn w:val="Standaard"/>
-    <w:next w:val="Standaard"/>
-    <w:link w:val="Kop3Char"/>
+    <w:basedOn w:val="Normal"/>
+    <w:next w:val="Normal"/>
+    <w:link w:val="Heading3Char"/>
     <w:uiPriority w:val="9"/>
     <w:unhideWhenUsed/>
     <w:qFormat/>
@@ -7307,11 +8238,11 @@
       <w:szCs w:val="24"/>
     </w:rPr>
   </w:style>
-  <w:style w:type="paragraph" w:styleId="Kop4">
+  <w:style w:type="paragraph" w:styleId="Heading4">
     <w:name w:val="heading 4"/>
-    <w:basedOn w:val="Standaard"/>
-    <w:next w:val="Standaard"/>
-    <w:link w:val="Kop4Char"/>
+    <w:basedOn w:val="Normal"/>
+    <w:next w:val="Normal"/>
+    <w:link w:val="Heading4Char"/>
     <w:uiPriority w:val="9"/>
     <w:semiHidden/>
     <w:unhideWhenUsed/>
@@ -7330,11 +8261,11 @@
       <w:color w:val="000000" w:themeColor="text1"/>
     </w:rPr>
   </w:style>
-  <w:style w:type="paragraph" w:styleId="Kop6">
+  <w:style w:type="paragraph" w:styleId="Heading6">
     <w:name w:val="heading 6"/>
-    <w:basedOn w:val="Standaard"/>
-    <w:next w:val="Standaard"/>
-    <w:link w:val="Kop6Char"/>
+    <w:basedOn w:val="Normal"/>
+    <w:next w:val="Normal"/>
+    <w:link w:val="Heading6Char"/>
     <w:uiPriority w:val="9"/>
     <w:semiHidden/>
     <w:unhideWhenUsed/>
@@ -7351,13 +8282,12 @@
       <w:color w:val="1F4D78" w:themeColor="accent1" w:themeShade="7F"/>
     </w:rPr>
   </w:style>
-  <w:style w:type="character" w:default="1" w:styleId="Standaardalinea-lettertype">
+  <w:style w:type="character" w:default="1" w:styleId="DefaultParagraphFont">
     <w:name w:val="Default Paragraph Font"/>
     <w:uiPriority w:val="1"/>
-    <w:semiHidden/>
     <w:unhideWhenUsed/>
   </w:style>
-  <w:style w:type="table" w:default="1" w:styleId="Standaardtabel">
+  <w:style w:type="table" w:default="1" w:styleId="TableNormal">
     <w:name w:val="Normal Table"/>
     <w:uiPriority w:val="99"/>
     <w:semiHidden/>
@@ -7372,16 +8302,16 @@
       </w:tblCellMar>
     </w:tblPr>
   </w:style>
-  <w:style w:type="numbering" w:default="1" w:styleId="Geenlijst">
+  <w:style w:type="numbering" w:default="1" w:styleId="NoList">
     <w:name w:val="No List"/>
     <w:uiPriority w:val="99"/>
     <w:semiHidden/>
     <w:unhideWhenUsed/>
   </w:style>
-  <w:style w:type="paragraph" w:styleId="Koptekst">
+  <w:style w:type="paragraph" w:styleId="Header">
     <w:name w:val="header"/>
-    <w:basedOn w:val="Standaard"/>
-    <w:link w:val="KoptekstChar"/>
+    <w:basedOn w:val="Normal"/>
+    <w:link w:val="HeaderChar"/>
     <w:uiPriority w:val="99"/>
     <w:unhideWhenUsed/>
     <w:rsid w:val="003D0CAD"/>
@@ -7393,17 +8323,17 @@
       <w:spacing w:after="0" w:line="240" w:lineRule="auto"/>
     </w:pPr>
   </w:style>
-  <w:style w:type="character" w:customStyle="1" w:styleId="KoptekstChar">
-    <w:name w:val="Koptekst Char"/>
-    <w:basedOn w:val="Standaardalinea-lettertype"/>
-    <w:link w:val="Koptekst"/>
+  <w:style w:type="character" w:customStyle="1" w:styleId="HeaderChar">
+    <w:name w:val="Header Char"/>
+    <w:basedOn w:val="DefaultParagraphFont"/>
+    <w:link w:val="Header"/>
     <w:uiPriority w:val="99"/>
     <w:rsid w:val="003D0CAD"/>
   </w:style>
-  <w:style w:type="paragraph" w:styleId="Voettekst">
+  <w:style w:type="paragraph" w:styleId="Footer">
     <w:name w:val="footer"/>
-    <w:basedOn w:val="Standaard"/>
-    <w:link w:val="VoettekstChar"/>
+    <w:basedOn w:val="Normal"/>
+    <w:link w:val="FooterChar"/>
     <w:uiPriority w:val="99"/>
     <w:unhideWhenUsed/>
     <w:rsid w:val="003D0CAD"/>
@@ -7415,16 +8345,16 @@
       <w:spacing w:after="0" w:line="240" w:lineRule="auto"/>
     </w:pPr>
   </w:style>
-  <w:style w:type="character" w:customStyle="1" w:styleId="VoettekstChar">
-    <w:name w:val="Voettekst Char"/>
-    <w:basedOn w:val="Standaardalinea-lettertype"/>
-    <w:link w:val="Voettekst"/>
+  <w:style w:type="character" w:customStyle="1" w:styleId="FooterChar">
+    <w:name w:val="Footer Char"/>
+    <w:basedOn w:val="DefaultParagraphFont"/>
+    <w:link w:val="Footer"/>
     <w:uiPriority w:val="99"/>
     <w:rsid w:val="003D0CAD"/>
   </w:style>
-  <w:style w:type="table" w:styleId="Tabelraster">
+  <w:style w:type="table" w:styleId="TableGrid">
     <w:name w:val="Table Grid"/>
-    <w:basedOn w:val="Standaardtabel"/>
+    <w:basedOn w:val="TableNormal"/>
     <w:uiPriority w:val="59"/>
     <w:rsid w:val="003D0CAD"/>
     <w:pPr>
@@ -7441,9 +8371,9 @@
       </w:tblBorders>
     </w:tblPr>
   </w:style>
-  <w:style w:type="paragraph" w:styleId="Lijstalinea">
+  <w:style w:type="paragraph" w:styleId="ListParagraph">
     <w:name w:val="List Paragraph"/>
-    <w:basedOn w:val="Standaard"/>
+    <w:basedOn w:val="Normal"/>
     <w:uiPriority w:val="34"/>
     <w:qFormat/>
     <w:rsid w:val="00716F2B"/>
@@ -7452,10 +8382,10 @@
       <w:contextualSpacing/>
     </w:pPr>
   </w:style>
-  <w:style w:type="character" w:customStyle="1" w:styleId="Kop1Char">
-    <w:name w:val="Kop 1 Char"/>
-    <w:basedOn w:val="Standaardalinea-lettertype"/>
-    <w:link w:val="Kop1"/>
+  <w:style w:type="character" w:customStyle="1" w:styleId="Heading1Char">
+    <w:name w:val="Heading 1 Char"/>
+    <w:basedOn w:val="DefaultParagraphFont"/>
+    <w:link w:val="Heading1"/>
     <w:uiPriority w:val="9"/>
     <w:rsid w:val="00AE17AC"/>
     <w:rPr>
@@ -7465,10 +8395,10 @@
       <w:szCs w:val="32"/>
     </w:rPr>
   </w:style>
-  <w:style w:type="character" w:customStyle="1" w:styleId="Kop2Char">
-    <w:name w:val="Kop 2 Char"/>
-    <w:basedOn w:val="Standaardalinea-lettertype"/>
-    <w:link w:val="Kop2"/>
+  <w:style w:type="character" w:customStyle="1" w:styleId="Heading2Char">
+    <w:name w:val="Heading 2 Char"/>
+    <w:basedOn w:val="DefaultParagraphFont"/>
+    <w:link w:val="Heading2"/>
     <w:uiPriority w:val="9"/>
     <w:rsid w:val="00B44264"/>
     <w:rPr>
@@ -7478,10 +8408,10 @@
       <w:szCs w:val="26"/>
     </w:rPr>
   </w:style>
-  <w:style w:type="character" w:customStyle="1" w:styleId="Kop3Char">
-    <w:name w:val="Kop 3 Char"/>
-    <w:basedOn w:val="Standaardalinea-lettertype"/>
-    <w:link w:val="Kop3"/>
+  <w:style w:type="character" w:customStyle="1" w:styleId="Heading3Char">
+    <w:name w:val="Heading 3 Char"/>
+    <w:basedOn w:val="DefaultParagraphFont"/>
+    <w:link w:val="Heading3"/>
     <w:uiPriority w:val="9"/>
     <w:rsid w:val="00B44264"/>
     <w:rPr>
@@ -7491,10 +8421,10 @@
       <w:szCs w:val="24"/>
     </w:rPr>
   </w:style>
-  <w:style w:type="character" w:customStyle="1" w:styleId="Kop4Char">
-    <w:name w:val="Kop 4 Char"/>
-    <w:basedOn w:val="Standaardalinea-lettertype"/>
-    <w:link w:val="Kop4"/>
+  <w:style w:type="character" w:customStyle="1" w:styleId="Heading4Char">
+    <w:name w:val="Heading 4 Char"/>
+    <w:basedOn w:val="DefaultParagraphFont"/>
+    <w:link w:val="Heading4"/>
     <w:uiPriority w:val="9"/>
     <w:semiHidden/>
     <w:rsid w:val="00B44264"/>
@@ -7505,10 +8435,10 @@
       <w:color w:val="000000" w:themeColor="text1"/>
     </w:rPr>
   </w:style>
-  <w:style w:type="paragraph" w:styleId="Ballontekst">
+  <w:style w:type="paragraph" w:styleId="BalloonText">
     <w:name w:val="Balloon Text"/>
-    <w:basedOn w:val="Standaard"/>
-    <w:link w:val="BallontekstChar"/>
+    <w:basedOn w:val="Normal"/>
+    <w:link w:val="BalloonTextChar"/>
     <w:uiPriority w:val="99"/>
     <w:semiHidden/>
     <w:unhideWhenUsed/>
@@ -7522,10 +8452,10 @@
       <w:szCs w:val="16"/>
     </w:rPr>
   </w:style>
-  <w:style w:type="character" w:customStyle="1" w:styleId="BallontekstChar">
-    <w:name w:val="Ballontekst Char"/>
-    <w:basedOn w:val="Standaardalinea-lettertype"/>
-    <w:link w:val="Ballontekst"/>
+  <w:style w:type="character" w:customStyle="1" w:styleId="BalloonTextChar">
+    <w:name w:val="Balloon Text Char"/>
+    <w:basedOn w:val="DefaultParagraphFont"/>
+    <w:link w:val="BalloonText"/>
     <w:uiPriority w:val="99"/>
     <w:semiHidden/>
     <w:rsid w:val="00756DEF"/>
@@ -7535,10 +8465,10 @@
       <w:szCs w:val="16"/>
     </w:rPr>
   </w:style>
-  <w:style w:type="paragraph" w:styleId="Kopvaninhoudsopgave">
+  <w:style w:type="paragraph" w:styleId="TOCHeading">
     <w:name w:val="TOC Heading"/>
-    <w:basedOn w:val="Kop1"/>
-    <w:next w:val="Standaard"/>
+    <w:basedOn w:val="Heading1"/>
+    <w:next w:val="Normal"/>
     <w:uiPriority w:val="39"/>
     <w:unhideWhenUsed/>
     <w:qFormat/>
@@ -7557,10 +8487,10 @@
       <w:lang w:eastAsia="nl-NL"/>
     </w:rPr>
   </w:style>
-  <w:style w:type="paragraph" w:styleId="Inhopg1">
+  <w:style w:type="paragraph" w:styleId="TOC1">
     <w:name w:val="toc 1"/>
-    <w:basedOn w:val="Standaard"/>
-    <w:next w:val="Standaard"/>
+    <w:basedOn w:val="Normal"/>
+    <w:next w:val="Normal"/>
     <w:autoRedefine/>
     <w:uiPriority w:val="39"/>
     <w:unhideWhenUsed/>
@@ -7571,7 +8501,7 @@
   </w:style>
   <w:style w:type="character" w:styleId="Hyperlink">
     <w:name w:val="Hyperlink"/>
-    <w:basedOn w:val="Standaardalinea-lettertype"/>
+    <w:basedOn w:val="DefaultParagraphFont"/>
     <w:uiPriority w:val="99"/>
     <w:unhideWhenUsed/>
     <w:rsid w:val="00DD7202"/>
@@ -7580,11 +8510,11 @@
       <w:u w:val="single"/>
     </w:rPr>
   </w:style>
-  <w:style w:type="paragraph" w:styleId="Titel">
+  <w:style w:type="paragraph" w:styleId="Title">
     <w:name w:val="Title"/>
-    <w:basedOn w:val="Standaard"/>
-    <w:next w:val="Standaard"/>
-    <w:link w:val="TitelChar"/>
+    <w:basedOn w:val="Normal"/>
+    <w:next w:val="Normal"/>
+    <w:link w:val="TitleChar"/>
     <w:uiPriority w:val="10"/>
     <w:qFormat/>
     <w:rsid w:val="00DD7202"/>
@@ -7604,10 +8534,10 @@
       <w:szCs w:val="52"/>
     </w:rPr>
   </w:style>
-  <w:style w:type="character" w:customStyle="1" w:styleId="TitelChar">
-    <w:name w:val="Titel Char"/>
-    <w:basedOn w:val="Standaardalinea-lettertype"/>
-    <w:link w:val="Titel"/>
+  <w:style w:type="character" w:customStyle="1" w:styleId="TitleChar">
+    <w:name w:val="Title Char"/>
+    <w:basedOn w:val="DefaultParagraphFont"/>
+    <w:link w:val="Title"/>
     <w:uiPriority w:val="10"/>
     <w:rsid w:val="00DD7202"/>
     <w:rPr>
@@ -7619,11 +8549,11 @@
       <w:szCs w:val="52"/>
     </w:rPr>
   </w:style>
-  <w:style w:type="paragraph" w:styleId="Ondertitel">
+  <w:style w:type="paragraph" w:styleId="Subtitle">
     <w:name w:val="Subtitle"/>
-    <w:basedOn w:val="Standaard"/>
-    <w:next w:val="Standaard"/>
-    <w:link w:val="OndertitelChar"/>
+    <w:basedOn w:val="Normal"/>
+    <w:next w:val="Normal"/>
+    <w:link w:val="SubtitleChar"/>
     <w:uiPriority w:val="11"/>
     <w:qFormat/>
     <w:rsid w:val="00DD7202"/>
@@ -7642,10 +8572,10 @@
       <w:szCs w:val="24"/>
     </w:rPr>
   </w:style>
-  <w:style w:type="character" w:customStyle="1" w:styleId="OndertitelChar">
-    <w:name w:val="Ondertitel Char"/>
-    <w:basedOn w:val="Standaardalinea-lettertype"/>
-    <w:link w:val="Ondertitel"/>
+  <w:style w:type="character" w:customStyle="1" w:styleId="SubtitleChar">
+    <w:name w:val="Subtitle Char"/>
+    <w:basedOn w:val="DefaultParagraphFont"/>
+    <w:link w:val="Subtitle"/>
     <w:uiPriority w:val="11"/>
     <w:rsid w:val="00DD7202"/>
     <w:rPr>
@@ -7658,9 +8588,9 @@
       <w:szCs w:val="24"/>
     </w:rPr>
   </w:style>
-  <w:style w:type="character" w:styleId="Verwijzingopmerking">
+  <w:style w:type="character" w:styleId="CommentReference">
     <w:name w:val="annotation reference"/>
-    <w:basedOn w:val="Standaardalinea-lettertype"/>
+    <w:basedOn w:val="DefaultParagraphFont"/>
     <w:uiPriority w:val="99"/>
     <w:semiHidden/>
     <w:unhideWhenUsed/>
@@ -7670,10 +8600,10 @@
       <w:szCs w:val="18"/>
     </w:rPr>
   </w:style>
-  <w:style w:type="paragraph" w:styleId="Tekstopmerking">
+  <w:style w:type="paragraph" w:styleId="CommentText">
     <w:name w:val="annotation text"/>
-    <w:basedOn w:val="Standaard"/>
-    <w:link w:val="TekstopmerkingChar"/>
+    <w:basedOn w:val="Normal"/>
+    <w:link w:val="CommentTextChar"/>
     <w:uiPriority w:val="99"/>
     <w:semiHidden/>
     <w:unhideWhenUsed/>
@@ -7686,10 +8616,10 @@
       <w:szCs w:val="24"/>
     </w:rPr>
   </w:style>
-  <w:style w:type="character" w:customStyle="1" w:styleId="TekstopmerkingChar">
-    <w:name w:val="Tekst opmerking Char"/>
-    <w:basedOn w:val="Standaardalinea-lettertype"/>
-    <w:link w:val="Tekstopmerking"/>
+  <w:style w:type="character" w:customStyle="1" w:styleId="CommentTextChar">
+    <w:name w:val="Comment Text Char"/>
+    <w:basedOn w:val="DefaultParagraphFont"/>
+    <w:link w:val="CommentText"/>
     <w:uiPriority w:val="99"/>
     <w:semiHidden/>
     <w:rsid w:val="001F68CA"/>
@@ -7698,11 +8628,11 @@
       <w:szCs w:val="24"/>
     </w:rPr>
   </w:style>
-  <w:style w:type="paragraph" w:styleId="Onderwerpvanopmerking">
+  <w:style w:type="paragraph" w:styleId="CommentSubject">
     <w:name w:val="annotation subject"/>
-    <w:basedOn w:val="Tekstopmerking"/>
-    <w:next w:val="Tekstopmerking"/>
-    <w:link w:val="OnderwerpvanopmerkingChar"/>
+    <w:basedOn w:val="CommentText"/>
+    <w:next w:val="CommentText"/>
+    <w:link w:val="CommentSubjectChar"/>
     <w:uiPriority w:val="99"/>
     <w:semiHidden/>
     <w:unhideWhenUsed/>
@@ -7714,10 +8644,10 @@
       <w:szCs w:val="20"/>
     </w:rPr>
   </w:style>
-  <w:style w:type="character" w:customStyle="1" w:styleId="OnderwerpvanopmerkingChar">
-    <w:name w:val="Onderwerp van opmerking Char"/>
-    <w:basedOn w:val="TekstopmerkingChar"/>
-    <w:link w:val="Onderwerpvanopmerking"/>
+  <w:style w:type="character" w:customStyle="1" w:styleId="CommentSubjectChar">
+    <w:name w:val="Comment Subject Char"/>
+    <w:basedOn w:val="CommentTextChar"/>
+    <w:link w:val="CommentSubject"/>
     <w:uiPriority w:val="99"/>
     <w:semiHidden/>
     <w:rsid w:val="001F68CA"/>
@@ -7730,12 +8660,12 @@
   </w:style>
   <w:style w:type="character" w:customStyle="1" w:styleId="lewnzc">
     <w:name w:val="lewnzc"/>
-    <w:basedOn w:val="Standaardalinea-lettertype"/>
+    <w:basedOn w:val="DefaultParagraphFont"/>
     <w:rsid w:val="003A1469"/>
   </w:style>
-  <w:style w:type="character" w:styleId="Nadruk">
+  <w:style w:type="character" w:styleId="Emphasis">
     <w:name w:val="Emphasis"/>
-    <w:basedOn w:val="Standaardalinea-lettertype"/>
+    <w:basedOn w:val="DefaultParagraphFont"/>
     <w:uiPriority w:val="20"/>
     <w:qFormat/>
     <w:rsid w:val="003A1469"/>
@@ -7746,10 +8676,10 @@
   </w:style>
   <w:style w:type="character" w:customStyle="1" w:styleId="tlssbb">
     <w:name w:val="tlssbb"/>
-    <w:basedOn w:val="Standaardalinea-lettertype"/>
+    <w:basedOn w:val="DefaultParagraphFont"/>
     <w:rsid w:val="00B2286A"/>
   </w:style>
-  <w:style w:type="paragraph" w:styleId="Geenafstand">
+  <w:style w:type="paragraph" w:styleId="NoSpacing">
     <w:name w:val="No Spacing"/>
     <w:uiPriority w:val="1"/>
     <w:qFormat/>
@@ -7758,10 +8688,10 @@
       <w:spacing w:after="0" w:line="240" w:lineRule="auto"/>
     </w:pPr>
   </w:style>
-  <w:style w:type="character" w:customStyle="1" w:styleId="Kop6Char">
-    <w:name w:val="Kop 6 Char"/>
-    <w:basedOn w:val="Standaardalinea-lettertype"/>
-    <w:link w:val="Kop6"/>
+  <w:style w:type="character" w:customStyle="1" w:styleId="Heading6Char">
+    <w:name w:val="Heading 6 Char"/>
+    <w:basedOn w:val="DefaultParagraphFont"/>
+    <w:link w:val="Heading6"/>
     <w:uiPriority w:val="9"/>
     <w:semiHidden/>
     <w:rsid w:val="00710649"/>
@@ -7770,10 +8700,10 @@
       <w:color w:val="1F4D78" w:themeColor="accent1" w:themeShade="7F"/>
     </w:rPr>
   </w:style>
-  <w:style w:type="paragraph" w:styleId="Inhopg3">
+  <w:style w:type="paragraph" w:styleId="TOC3">
     <w:name w:val="toc 3"/>
-    <w:basedOn w:val="Standaard"/>
-    <w:next w:val="Standaard"/>
+    <w:basedOn w:val="Normal"/>
+    <w:next w:val="Normal"/>
     <w:autoRedefine/>
     <w:uiPriority w:val="39"/>
     <w:unhideWhenUsed/>
@@ -7783,10 +8713,10 @@
       <w:ind w:left="440"/>
     </w:pPr>
   </w:style>
-  <w:style w:type="paragraph" w:styleId="Inhopg2">
+  <w:style w:type="paragraph" w:styleId="TOC2">
     <w:name w:val="toc 2"/>
-    <w:basedOn w:val="Standaard"/>
-    <w:next w:val="Standaard"/>
+    <w:basedOn w:val="Normal"/>
+    <w:next w:val="Normal"/>
     <w:autoRedefine/>
     <w:uiPriority w:val="39"/>
     <w:unhideWhenUsed/>
@@ -7795,6 +8725,19 @@
       <w:spacing w:after="100"/>
       <w:ind w:left="220"/>
     </w:pPr>
+  </w:style>
+  <w:style w:type="paragraph" w:styleId="NormalWeb">
+    <w:name w:val="Normal (Web)"/>
+    <w:basedOn w:val="Normal"/>
+    <w:uiPriority w:val="99"/>
+    <w:semiHidden/>
+    <w:unhideWhenUsed/>
+    <w:rsid w:val="000530AA"/>
+    <w:rPr>
+      <w:rFonts w:ascii="Times New Roman" w:hAnsi="Times New Roman" w:cs="Times New Roman"/>
+      <w:sz w:val="24"/>
+      <w:szCs w:val="24"/>
+    </w:rPr>
   </w:style>
 </w:styles>
 </file>
@@ -8061,54 +9004,35 @@
 </file>
 
 <file path=customXml/item1.xml><?xml version="1.0" encoding="utf-8"?>
-<?mso-contentType ?>
-<FormTemplates xmlns="http://schemas.microsoft.com/sharepoint/v3/contenttype/forms">
-  <Display>DocumentLibraryForm</Display>
-  <Edit>DocumentLibraryForm</Edit>
-  <New>DocumentLibraryForm</New>
-</FormTemplates>
+<b:Sources xmlns:b="http://schemas.openxmlformats.org/officeDocument/2006/bibliography" xmlns="http://schemas.openxmlformats.org/officeDocument/2006/bibliography" SelectedStyle="\APASixthEditionOfficeOnline.xsl" StyleName="APA" Version="6"/>
 </file>
 
 <file path=customXml/item2.xml><?xml version="1.0" encoding="utf-8"?>
-<b:Sources xmlns:b="http://schemas.openxmlformats.org/officeDocument/2006/bibliography" xmlns="http://schemas.openxmlformats.org/officeDocument/2006/bibliography" SelectedStyle="\APASixthEditionOfficeOnline.xsl" StyleName="APA" Version="6"/>
-</file>
-
-<file path=customXml/item3.xml><?xml version="1.0" encoding="utf-8"?>
 <p:properties xmlns:p="http://schemas.microsoft.com/office/2006/metadata/properties" xmlns:xsi="http://www.w3.org/2001/XMLSchema-instance" xmlns:pc="http://schemas.microsoft.com/office/infopath/2007/PartnerControls">
   <documentManagement>
-    <TaxCatchAll xmlns="32dd6115-ce5d-46b4-b638-9e7d5ca6cbee" xsi:nil="true"/>
-    <lcf76f155ced4ddcb4097134ff3c332f xmlns="094ecc41-7a37-40c9-8390-f18431712098">
-      <Terms xmlns="http://schemas.microsoft.com/office/infopath/2007/PartnerControls"/>
-    </lcf76f155ced4ddcb4097134ff3c332f>
+    <ReferenceId xmlns="f146dede-f291-467c-b2a9-cc4ee6b7da56" xsi:nil="true"/>
   </documentManagement>
 </p:properties>
 </file>
 
-<file path=customXml/item4.xml><?xml version="1.0" encoding="utf-8"?>
-<ct:contentTypeSchema xmlns:ct="http://schemas.microsoft.com/office/2006/metadata/contentType" xmlns:ma="http://schemas.microsoft.com/office/2006/metadata/properties/metaAttributes" ct:_="" ma:_="" ma:contentTypeName="Document" ma:contentTypeID="0x010100D5188FA4F7421B4A93E65E307A769E27" ma:contentTypeVersion="15" ma:contentTypeDescription="Een nieuw document maken." ma:contentTypeScope="" ma:versionID="9bfd002f47f5f7e7b2724518f3fad1a5">
-  <xsd:schema xmlns:xsd="http://www.w3.org/2001/XMLSchema" xmlns:xs="http://www.w3.org/2001/XMLSchema" xmlns:p="http://schemas.microsoft.com/office/2006/metadata/properties" xmlns:ns2="094ecc41-7a37-40c9-8390-f18431712098" xmlns:ns3="32dd6115-ce5d-46b4-b638-9e7d5ca6cbee" targetNamespace="http://schemas.microsoft.com/office/2006/metadata/properties" ma:root="true" ma:fieldsID="e2c1118370456e9a6d2939e9bd0f2e89" ns2:_="" ns3:_="">
-    <xsd:import namespace="094ecc41-7a37-40c9-8390-f18431712098"/>
-    <xsd:import namespace="32dd6115-ce5d-46b4-b638-9e7d5ca6cbee"/>
+<file path=customXml/item3.xml><?xml version="1.0" encoding="utf-8"?>
+<ct:contentTypeSchema xmlns:ct="http://schemas.microsoft.com/office/2006/metadata/contentType" xmlns:ma="http://schemas.microsoft.com/office/2006/metadata/properties/metaAttributes" ct:_="" ma:_="" ma:contentTypeName="Document" ma:contentTypeID="0x0101009D3FF5477DB7A244AC392F0BFF90651A" ma:contentTypeVersion="8" ma:contentTypeDescription="Een nieuw document maken." ma:contentTypeScope="" ma:versionID="933532a4e7ce8c1b9fcdbc3dd44e24d3">
+  <xsd:schema xmlns:xsd="http://www.w3.org/2001/XMLSchema" xmlns:xs="http://www.w3.org/2001/XMLSchema" xmlns:p="http://schemas.microsoft.com/office/2006/metadata/properties" xmlns:ns2="f146dede-f291-467c-b2a9-cc4ee6b7da56" targetNamespace="http://schemas.microsoft.com/office/2006/metadata/properties" ma:root="true" ma:fieldsID="8b762ee4c99d9e205bc6ace67086e7be" ns2:_="">
+    <xsd:import namespace="f146dede-f291-467c-b2a9-cc4ee6b7da56"/>
     <xsd:element name="properties">
       <xsd:complexType>
         <xsd:sequence>
           <xsd:element name="documentManagement">
             <xsd:complexType>
               <xsd:all>
+                <xsd:element ref="ns2:ReferenceId" minOccurs="0"/>
                 <xsd:element ref="ns2:MediaServiceMetadata" minOccurs="0"/>
                 <xsd:element ref="ns2:MediaServiceFastMetadata" minOccurs="0"/>
-                <xsd:element ref="ns2:lcf76f155ced4ddcb4097134ff3c332f" minOccurs="0"/>
-                <xsd:element ref="ns3:TaxCatchAll" minOccurs="0"/>
-                <xsd:element ref="ns2:MediaServiceOCR" minOccurs="0"/>
+                <xsd:element ref="ns2:MediaServiceSearchProperties" minOccurs="0"/>
+                <xsd:element ref="ns2:MediaServiceBillingMetadata" minOccurs="0"/>
                 <xsd:element ref="ns2:MediaServiceGenerationTime" minOccurs="0"/>
                 <xsd:element ref="ns2:MediaServiceEventHashCode" minOccurs="0"/>
-                <xsd:element ref="ns2:MediaServiceDateTaken" minOccurs="0"/>
-                <xsd:element ref="ns2:MediaServiceObjectDetectorVersions" minOccurs="0"/>
-                <xsd:element ref="ns3:SharedWithUsers" minOccurs="0"/>
-                <xsd:element ref="ns3:SharedWithDetails" minOccurs="0"/>
                 <xsd:element ref="ns2:MediaLengthInSeconds" minOccurs="0"/>
-                <xsd:element ref="ns2:MediaServiceSearchProperties" minOccurs="0"/>
-                <xsd:element ref="ns2:MediaServiceLocation" minOccurs="0"/>
               </xsd:all>
             </xsd:complexType>
           </xsd:element>
@@ -8116,107 +9040,47 @@
       </xsd:complexType>
     </xsd:element>
   </xsd:schema>
-  <xsd:schema xmlns:xsd="http://www.w3.org/2001/XMLSchema" xmlns:xs="http://www.w3.org/2001/XMLSchema" xmlns:dms="http://schemas.microsoft.com/office/2006/documentManagement/types" xmlns:pc="http://schemas.microsoft.com/office/infopath/2007/PartnerControls" targetNamespace="094ecc41-7a37-40c9-8390-f18431712098" elementFormDefault="qualified">
+  <xsd:schema xmlns:xsd="http://www.w3.org/2001/XMLSchema" xmlns:xs="http://www.w3.org/2001/XMLSchema" xmlns:dms="http://schemas.microsoft.com/office/2006/documentManagement/types" xmlns:pc="http://schemas.microsoft.com/office/infopath/2007/PartnerControls" targetNamespace="f146dede-f291-467c-b2a9-cc4ee6b7da56" elementFormDefault="qualified">
     <xsd:import namespace="http://schemas.microsoft.com/office/2006/documentManagement/types"/>
     <xsd:import namespace="http://schemas.microsoft.com/office/infopath/2007/PartnerControls"/>
-    <xsd:element name="MediaServiceMetadata" ma:index="8" nillable="true" ma:displayName="MediaServiceMetadata" ma:hidden="true" ma:internalName="MediaServiceMetadata" ma:readOnly="true">
+    <xsd:element name="ReferenceId" ma:index="8" nillable="true" ma:displayName="ReferenceId" ma:indexed="true" ma:internalName="ReferenceId">
+      <xsd:simpleType>
+        <xsd:restriction base="dms:Text"/>
+      </xsd:simpleType>
+    </xsd:element>
+    <xsd:element name="MediaServiceMetadata" ma:index="9" nillable="true" ma:displayName="MediaServiceMetadata" ma:hidden="true" ma:internalName="MediaServiceMetadata" ma:readOnly="true">
       <xsd:simpleType>
         <xsd:restriction base="dms:Note"/>
       </xsd:simpleType>
     </xsd:element>
-    <xsd:element name="MediaServiceFastMetadata" ma:index="9" nillable="true" ma:displayName="MediaServiceFastMetadata" ma:hidden="true" ma:internalName="MediaServiceFastMetadata" ma:readOnly="true">
+    <xsd:element name="MediaServiceFastMetadata" ma:index="10" nillable="true" ma:displayName="MediaServiceFastMetadata" ma:hidden="true" ma:internalName="MediaServiceFastMetadata" ma:readOnly="true">
       <xsd:simpleType>
         <xsd:restriction base="dms:Note"/>
       </xsd:simpleType>
     </xsd:element>
-    <xsd:element name="lcf76f155ced4ddcb4097134ff3c332f" ma:index="11" nillable="true" ma:taxonomy="true" ma:internalName="lcf76f155ced4ddcb4097134ff3c332f" ma:taxonomyFieldName="MediaServiceImageTags" ma:displayName="Afbeeldingtags" ma:readOnly="false" ma:fieldId="{5cf76f15-5ced-4ddc-b409-7134ff3c332f}" ma:taxonomyMulti="true" ma:sspId="913d8191-1fa0-4b0e-82ea-9b3ed889c571" ma:termSetId="09814cd3-568e-fe90-9814-8d621ff8fb84" ma:anchorId="fba54fb3-c3e1-fe81-a776-ca4b69148c4d" ma:open="true" ma:isKeyword="false">
-      <xsd:complexType>
-        <xsd:sequence>
-          <xsd:element ref="pc:Terms" minOccurs="0" maxOccurs="1"/>
-        </xsd:sequence>
-      </xsd:complexType>
-    </xsd:element>
-    <xsd:element name="MediaServiceOCR" ma:index="13" nillable="true" ma:displayName="Extracted Text" ma:internalName="MediaServiceOCR" ma:readOnly="true">
+    <xsd:element name="MediaServiceSearchProperties" ma:index="11" nillable="true" ma:displayName="MediaServiceSearchProperties" ma:hidden="true" ma:internalName="MediaServiceSearchProperties" ma:readOnly="true">
       <xsd:simpleType>
-        <xsd:restriction base="dms:Note">
-          <xsd:maxLength value="255"/>
-        </xsd:restriction>
+        <xsd:restriction base="dms:Note"/>
       </xsd:simpleType>
     </xsd:element>
-    <xsd:element name="MediaServiceGenerationTime" ma:index="14" nillable="true" ma:displayName="MediaServiceGenerationTime" ma:hidden="true" ma:internalName="MediaServiceGenerationTime" ma:readOnly="true">
+    <xsd:element name="MediaServiceBillingMetadata" ma:index="12" nillable="true" ma:displayName="MediaServiceBillingMetadata" ma:hidden="true" ma:internalName="MediaServiceBillingMetadata" ma:readOnly="true">
+      <xsd:simpleType>
+        <xsd:restriction base="dms:Note"/>
+      </xsd:simpleType>
+    </xsd:element>
+    <xsd:element name="MediaServiceGenerationTime" ma:index="13" nillable="true" ma:displayName="MediaServiceGenerationTime" ma:hidden="true" ma:internalName="MediaServiceGenerationTime" ma:readOnly="true">
       <xsd:simpleType>
         <xsd:restriction base="dms:Text"/>
       </xsd:simpleType>
     </xsd:element>
-    <xsd:element name="MediaServiceEventHashCode" ma:index="15" nillable="true" ma:displayName="MediaServiceEventHashCode" ma:hidden="true" ma:internalName="MediaServiceEventHashCode" ma:readOnly="true">
+    <xsd:element name="MediaServiceEventHashCode" ma:index="14" nillable="true" ma:displayName="MediaServiceEventHashCode" ma:hidden="true" ma:internalName="MediaServiceEventHashCode" ma:readOnly="true">
       <xsd:simpleType>
         <xsd:restriction base="dms:Text"/>
       </xsd:simpleType>
     </xsd:element>
-    <xsd:element name="MediaServiceDateTaken" ma:index="16" nillable="true" ma:displayName="MediaServiceDateTaken" ma:hidden="true" ma:indexed="true" ma:internalName="MediaServiceDateTaken" ma:readOnly="true">
-      <xsd:simpleType>
-        <xsd:restriction base="dms:Text"/>
-      </xsd:simpleType>
-    </xsd:element>
-    <xsd:element name="MediaServiceObjectDetectorVersions" ma:index="17" nillable="true" ma:displayName="MediaServiceObjectDetectorVersions" ma:hidden="true" ma:indexed="true" ma:internalName="MediaServiceObjectDetectorVersions" ma:readOnly="true">
-      <xsd:simpleType>
-        <xsd:restriction base="dms:Text"/>
-      </xsd:simpleType>
-    </xsd:element>
-    <xsd:element name="MediaLengthInSeconds" ma:index="20" nillable="true" ma:displayName="MediaLengthInSeconds" ma:hidden="true" ma:internalName="MediaLengthInSeconds" ma:readOnly="true">
+    <xsd:element name="MediaLengthInSeconds" ma:index="15" nillable="true" ma:displayName="MediaLengthInSeconds" ma:hidden="true" ma:internalName="MediaLengthInSeconds" ma:readOnly="true">
       <xsd:simpleType>
         <xsd:restriction base="dms:Unknown"/>
-      </xsd:simpleType>
-    </xsd:element>
-    <xsd:element name="MediaServiceSearchProperties" ma:index="21" nillable="true" ma:displayName="MediaServiceSearchProperties" ma:hidden="true" ma:internalName="MediaServiceSearchProperties" ma:readOnly="true">
-      <xsd:simpleType>
-        <xsd:restriction base="dms:Note"/>
-      </xsd:simpleType>
-    </xsd:element>
-    <xsd:element name="MediaServiceLocation" ma:index="22" nillable="true" ma:displayName="Location" ma:indexed="true" ma:internalName="MediaServiceLocation" ma:readOnly="true">
-      <xsd:simpleType>
-        <xsd:restriction base="dms:Text"/>
-      </xsd:simpleType>
-    </xsd:element>
-  </xsd:schema>
-  <xsd:schema xmlns:xsd="http://www.w3.org/2001/XMLSchema" xmlns:xs="http://www.w3.org/2001/XMLSchema" xmlns:dms="http://schemas.microsoft.com/office/2006/documentManagement/types" xmlns:pc="http://schemas.microsoft.com/office/infopath/2007/PartnerControls" targetNamespace="32dd6115-ce5d-46b4-b638-9e7d5ca6cbee" elementFormDefault="qualified">
-    <xsd:import namespace="http://schemas.microsoft.com/office/2006/documentManagement/types"/>
-    <xsd:import namespace="http://schemas.microsoft.com/office/infopath/2007/PartnerControls"/>
-    <xsd:element name="TaxCatchAll" ma:index="12" nillable="true" ma:displayName="Taxonomy Catch All Column" ma:hidden="true" ma:list="{3ce8e41d-e4ee-4c63-be71-563cd362734e}" ma:internalName="TaxCatchAll" ma:showField="CatchAllData" ma:web="32dd6115-ce5d-46b4-b638-9e7d5ca6cbee">
-      <xsd:complexType>
-        <xsd:complexContent>
-          <xsd:extension base="dms:MultiChoiceLookup">
-            <xsd:sequence>
-              <xsd:element name="Value" type="dms:Lookup" maxOccurs="unbounded" minOccurs="0" nillable="true"/>
-            </xsd:sequence>
-          </xsd:extension>
-        </xsd:complexContent>
-      </xsd:complexType>
-    </xsd:element>
-    <xsd:element name="SharedWithUsers" ma:index="18" nillable="true" ma:displayName="Gedeeld met" ma:internalName="SharedWithUsers" ma:readOnly="true">
-      <xsd:complexType>
-        <xsd:complexContent>
-          <xsd:extension base="dms:UserMulti">
-            <xsd:sequence>
-              <xsd:element name="UserInfo" minOccurs="0" maxOccurs="unbounded">
-                <xsd:complexType>
-                  <xsd:sequence>
-                    <xsd:element name="DisplayName" type="xsd:string" minOccurs="0"/>
-                    <xsd:element name="AccountId" type="dms:UserId" minOccurs="0" nillable="true"/>
-                    <xsd:element name="AccountType" type="xsd:string" minOccurs="0"/>
-                  </xsd:sequence>
-                </xsd:complexType>
-              </xsd:element>
-            </xsd:sequence>
-          </xsd:extension>
-        </xsd:complexContent>
-      </xsd:complexType>
-    </xsd:element>
-    <xsd:element name="SharedWithDetails" ma:index="19" nillable="true" ma:displayName="Gedeeld met details" ma:internalName="SharedWithDetails" ma:readOnly="true">
-      <xsd:simpleType>
-        <xsd:restriction base="dms:Note">
-          <xsd:maxLength value="255"/>
-        </xsd:restriction>
       </xsd:simpleType>
     </xsd:element>
   </xsd:schema>
@@ -8319,15 +9183,16 @@
 </ct:contentTypeSchema>
 </file>
 
-<file path=customXml/itemProps1.xml><?xml version="1.0" encoding="utf-8"?>
-<ds:datastoreItem xmlns:ds="http://schemas.openxmlformats.org/officeDocument/2006/customXml" ds:itemID="{C6916C6B-E06E-47CD-A094-BBBE44C5EA8C}">
-  <ds:schemaRefs>
-    <ds:schemaRef ds:uri="http://schemas.microsoft.com/sharepoint/v3/contenttype/forms"/>
-  </ds:schemaRefs>
-</ds:datastoreItem>
+<file path=customXml/item4.xml><?xml version="1.0" encoding="utf-8"?>
+<?mso-contentType ?>
+<FormTemplates xmlns="http://schemas.microsoft.com/sharepoint/v3/contenttype/forms">
+  <Display>DocumentLibraryForm</Display>
+  <Edit>DocumentLibraryForm</Edit>
+  <New>DocumentLibraryForm</New>
+</FormTemplates>
 </file>
 
-<file path=customXml/itemProps2.xml><?xml version="1.0" encoding="utf-8"?>
+<file path=customXml/itemProps1.xml><?xml version="1.0" encoding="utf-8"?>
 <ds:datastoreItem xmlns:ds="http://schemas.openxmlformats.org/officeDocument/2006/customXml" ds:itemID="{72B7D650-2FAA-4D72-B587-235E59E6AC26}">
   <ds:schemaRefs>
     <ds:schemaRef ds:uri="http://schemas.openxmlformats.org/officeDocument/2006/bibliography"/>
@@ -8335,26 +9200,24 @@
 </ds:datastoreItem>
 </file>
 
-<file path=customXml/itemProps3.xml><?xml version="1.0" encoding="utf-8"?>
+<file path=customXml/itemProps2.xml><?xml version="1.0" encoding="utf-8"?>
 <ds:datastoreItem xmlns:ds="http://schemas.openxmlformats.org/officeDocument/2006/customXml" ds:itemID="{846B1C81-E993-40E7-BCC5-DA63F0CD945C}">
   <ds:schemaRefs>
     <ds:schemaRef ds:uri="http://schemas.microsoft.com/office/2006/metadata/properties"/>
     <ds:schemaRef ds:uri="http://schemas.microsoft.com/office/infopath/2007/PartnerControls"/>
-    <ds:schemaRef ds:uri="32dd6115-ce5d-46b4-b638-9e7d5ca6cbee"/>
-    <ds:schemaRef ds:uri="094ecc41-7a37-40c9-8390-f18431712098"/>
+    <ds:schemaRef ds:uri="f146dede-f291-467c-b2a9-cc4ee6b7da56"/>
   </ds:schemaRefs>
 </ds:datastoreItem>
 </file>
 
-<file path=customXml/itemProps4.xml><?xml version="1.0" encoding="utf-8"?>
-<ds:datastoreItem xmlns:ds="http://schemas.openxmlformats.org/officeDocument/2006/customXml" ds:itemID="{7FB410C4-6DED-4E94-8F1E-FF9C8071DEDF}">
+<file path=customXml/itemProps3.xml><?xml version="1.0" encoding="utf-8"?>
+<ds:datastoreItem xmlns:ds="http://schemas.openxmlformats.org/officeDocument/2006/customXml" ds:itemID="{164E549E-9A43-4E3D-A487-5E3C09E6F616}">
   <ds:schemaRefs>
     <ds:schemaRef ds:uri="http://schemas.microsoft.com/office/2006/metadata/contentType"/>
     <ds:schemaRef ds:uri="http://schemas.microsoft.com/office/2006/metadata/properties/metaAttributes"/>
     <ds:schemaRef ds:uri="http://www.w3.org/2001/XMLSchema"/>
     <ds:schemaRef ds:uri="http://schemas.microsoft.com/office/2006/metadata/properties"/>
-    <ds:schemaRef ds:uri="094ecc41-7a37-40c9-8390-f18431712098"/>
-    <ds:schemaRef ds:uri="32dd6115-ce5d-46b4-b638-9e7d5ca6cbee"/>
+    <ds:schemaRef ds:uri="f146dede-f291-467c-b2a9-cc4ee6b7da56"/>
     <ds:schemaRef ds:uri="http://schemas.microsoft.com/office/2006/documentManagement/types"/>
     <ds:schemaRef ds:uri="http://schemas.microsoft.com/office/infopath/2007/PartnerControls"/>
     <ds:schemaRef ds:uri="http://schemas.openxmlformats.org/package/2006/metadata/core-properties"/>
@@ -8363,4 +9226,12 @@
     <ds:schemaRef ds:uri="http://schemas.microsoft.com/internal/obd"/>
   </ds:schemaRefs>
 </ds:datastoreItem>
+</file>
+
+<file path=customXml/itemProps4.xml><?xml version="1.0" encoding="utf-8"?>
+<ds:datastoreItem xmlns:ds="http://schemas.openxmlformats.org/officeDocument/2006/customXml" ds:itemID="{C6916C6B-E06E-47CD-A094-BBBE44C5EA8C}">
+  <ds:schemaRefs>
+    <ds:schemaRef ds:uri="http://schemas.microsoft.com/sharepoint/v3/contenttype/forms"/>
+  </ds:schemaRefs>
+</ds:datastoreItem>
 </file>
</xml_diff>